<commit_message>
Update Assignment 3 selected GRU model and report
</commit_message>
<xml_diff>
--- a/assigment-3/Assignment_3_Charis_Aletraris_report.docx
+++ b/assigment-3/Assignment_3_Charis_Aletraris_report.docx
@@ -12,6 +12,3927 @@
           <w:rtl w:val="0"/>
         </w:rPr>
         <w:t xml:space="preserve">Assignment 3 Charis Aletraris</w:t>
+      </w:r>
+    </w:p>
+    <w:p>
+      <w:pPr>
+        <w:pStyle w:val="Heading2"/>
+        <w:keepNext/>
+        <w:spacing w:after="180"/>
+      </w:pPr>
+      <w:r>
+        <w:t>Exercise 1 model comparison and selection</w:t>
+      </w:r>
+    </w:p>
+    <w:p>
+      <w:pPr>
+        <w:spacing w:after="140" w:line="254" w:lineRule="auto"/>
+      </w:pPr>
+      <w:r>
+        <w:rPr>
+          <w:rFonts w:ascii="Calibri" w:hAnsi="Calibri"/>
+          <w:b w:val="0"/>
+          <w:sz w:val="22"/>
+        </w:rPr>
+        <w:t>I compared SimpleRNN, GRU and LSTM networks with 1, 2 and 3 recurrent layers. Each of the nine experiments ran for 15 epochs on the same data split. I selected the 3-layer GRU: at epoch 3 it achieved both the highest validation accuracy, 89.38%, and the lowest validation binary cross-entropy, 0.2724, across the nine experiments. Test results were not used for this choice.</w:t>
+      </w:r>
+    </w:p>
+    <w:p>
+      <w:pPr>
+        <w:keepNext/>
+        <w:spacing w:after="140" w:line="254" w:lineRule="auto"/>
+      </w:pPr>
+      <w:r>
+        <w:rPr>
+          <w:rFonts w:ascii="Calibri" w:hAnsi="Calibri"/>
+          <w:b/>
+          <w:sz w:val="22"/>
+        </w:rPr>
+        <w:t>Best accuracy reached by each model family</w:t>
+      </w:r>
+    </w:p>
+    <w:tbl>
+      <w:tblPr>
+        <w:tblW w:type="auto" w:w="0"/>
+        <w:tblLayout w:type="fixed"/>
+        <w:tblLook w:firstColumn="1" w:firstRow="1" w:lastColumn="0" w:lastRow="0" w:noHBand="0" w:noVBand="1" w:val="04A0"/>
+      </w:tblPr>
+      <w:tblGrid>
+        <w:gridCol w:w="1512"/>
+        <w:gridCol w:w="864"/>
+        <w:gridCol w:w="864"/>
+        <w:gridCol w:w="2592"/>
+        <w:gridCol w:w="2448"/>
+      </w:tblGrid>
+      <w:tr>
+        <w:trPr>
+          <w:cantSplit/>
+          <w:tblHeader/>
+        </w:trPr>
+        <w:tc>
+          <w:tcPr>
+            <w:tcW w:type="dxa" w:w="1512"/>
+            <w:vAlign w:val="center"/>
+            <w:tcBorders>
+              <w:top w:val="single" w:sz="4" w:color="D9D9D9"/>
+              <w:left w:val="single" w:sz="4" w:color="D9D9D9"/>
+              <w:bottom w:val="single" w:sz="4" w:color="D9D9D9"/>
+              <w:right w:val="single" w:sz="4" w:color="D9D9D9"/>
+            </w:tcBorders>
+            <w:tcMar>
+              <w:top w:w="70" w:type="dxa"/>
+              <w:left w:w="70" w:type="dxa"/>
+              <w:bottom w:w="70" w:type="dxa"/>
+              <w:right w:w="70" w:type="dxa"/>
+            </w:tcMar>
+            <w:shd w:fill="E7EDF3"/>
+          </w:tcPr>
+          <w:p>
+            <w:pPr>
+              <w:spacing w:after="0" w:line="240" w:lineRule="auto"/>
+            </w:pPr>
+            <w:r>
+              <w:rPr>
+                <w:rFonts w:ascii="Calibri" w:hAnsi="Calibri"/>
+                <w:b/>
+                <w:sz w:val="20"/>
+              </w:rPr>
+              <w:t>Model</w:t>
+            </w:r>
+          </w:p>
+        </w:tc>
+        <w:tc>
+          <w:tcPr>
+            <w:tcW w:type="dxa" w:w="864"/>
+            <w:vAlign w:val="center"/>
+            <w:tcBorders>
+              <w:top w:val="single" w:sz="4" w:color="D9D9D9"/>
+              <w:left w:val="single" w:sz="4" w:color="D9D9D9"/>
+              <w:bottom w:val="single" w:sz="4" w:color="D9D9D9"/>
+              <w:right w:val="single" w:sz="4" w:color="D9D9D9"/>
+            </w:tcBorders>
+            <w:tcMar>
+              <w:top w:w="70" w:type="dxa"/>
+              <w:left w:w="70" w:type="dxa"/>
+              <w:bottom w:w="70" w:type="dxa"/>
+              <w:right w:w="70" w:type="dxa"/>
+            </w:tcMar>
+            <w:shd w:fill="E7EDF3"/>
+          </w:tcPr>
+          <w:p>
+            <w:pPr>
+              <w:spacing w:after="0" w:line="240" w:lineRule="auto"/>
+            </w:pPr>
+            <w:r>
+              <w:rPr>
+                <w:rFonts w:ascii="Calibri" w:hAnsi="Calibri"/>
+                <w:b/>
+                <w:sz w:val="20"/>
+              </w:rPr>
+              <w:t>Layers</w:t>
+            </w:r>
+          </w:p>
+        </w:tc>
+        <w:tc>
+          <w:tcPr>
+            <w:tcW w:type="dxa" w:w="864"/>
+            <w:vAlign w:val="center"/>
+            <w:tcBorders>
+              <w:top w:val="single" w:sz="4" w:color="D9D9D9"/>
+              <w:left w:val="single" w:sz="4" w:color="D9D9D9"/>
+              <w:bottom w:val="single" w:sz="4" w:color="D9D9D9"/>
+              <w:right w:val="single" w:sz="4" w:color="D9D9D9"/>
+            </w:tcBorders>
+            <w:tcMar>
+              <w:top w:w="70" w:type="dxa"/>
+              <w:left w:w="70" w:type="dxa"/>
+              <w:bottom w:w="70" w:type="dxa"/>
+              <w:right w:w="70" w:type="dxa"/>
+            </w:tcMar>
+            <w:shd w:fill="E7EDF3"/>
+          </w:tcPr>
+          <w:p>
+            <w:pPr>
+              <w:spacing w:after="0" w:line="240" w:lineRule="auto"/>
+            </w:pPr>
+            <w:r>
+              <w:rPr>
+                <w:rFonts w:ascii="Calibri" w:hAnsi="Calibri"/>
+                <w:b/>
+                <w:sz w:val="20"/>
+              </w:rPr>
+              <w:t>Epoch</w:t>
+            </w:r>
+          </w:p>
+        </w:tc>
+        <w:tc>
+          <w:tcPr>
+            <w:tcW w:type="dxa" w:w="2592"/>
+            <w:vAlign w:val="center"/>
+            <w:tcBorders>
+              <w:top w:val="single" w:sz="4" w:color="D9D9D9"/>
+              <w:left w:val="single" w:sz="4" w:color="D9D9D9"/>
+              <w:bottom w:val="single" w:sz="4" w:color="D9D9D9"/>
+              <w:right w:val="single" w:sz="4" w:color="D9D9D9"/>
+            </w:tcBorders>
+            <w:tcMar>
+              <w:top w:w="70" w:type="dxa"/>
+              <w:left w:w="70" w:type="dxa"/>
+              <w:bottom w:w="70" w:type="dxa"/>
+              <w:right w:w="70" w:type="dxa"/>
+            </w:tcMar>
+            <w:shd w:fill="E7EDF3"/>
+          </w:tcPr>
+          <w:p>
+            <w:pPr>
+              <w:spacing w:after="0" w:line="240" w:lineRule="auto"/>
+            </w:pPr>
+            <w:r>
+              <w:rPr>
+                <w:rFonts w:ascii="Calibri" w:hAnsi="Calibri"/>
+                <w:b/>
+                <w:sz w:val="20"/>
+              </w:rPr>
+              <w:t>Validation accuracy</w:t>
+            </w:r>
+          </w:p>
+        </w:tc>
+        <w:tc>
+          <w:tcPr>
+            <w:tcW w:type="dxa" w:w="2448"/>
+            <w:vAlign w:val="center"/>
+            <w:tcBorders>
+              <w:top w:val="single" w:sz="4" w:color="D9D9D9"/>
+              <w:left w:val="single" w:sz="4" w:color="D9D9D9"/>
+              <w:bottom w:val="single" w:sz="4" w:color="D9D9D9"/>
+              <w:right w:val="single" w:sz="4" w:color="D9D9D9"/>
+            </w:tcBorders>
+            <w:tcMar>
+              <w:top w:w="70" w:type="dxa"/>
+              <w:left w:w="70" w:type="dxa"/>
+              <w:bottom w:w="70" w:type="dxa"/>
+              <w:right w:w="70" w:type="dxa"/>
+            </w:tcMar>
+            <w:shd w:fill="E7EDF3"/>
+          </w:tcPr>
+          <w:p>
+            <w:pPr>
+              <w:spacing w:after="0" w:line="240" w:lineRule="auto"/>
+            </w:pPr>
+            <w:r>
+              <w:rPr>
+                <w:rFonts w:ascii="Calibri" w:hAnsi="Calibri"/>
+                <w:b/>
+                <w:sz w:val="20"/>
+              </w:rPr>
+              <w:t>Loss at that epoch</w:t>
+            </w:r>
+          </w:p>
+        </w:tc>
+      </w:tr>
+      <w:tr>
+        <w:trPr>
+          <w:cantSplit/>
+        </w:trPr>
+        <w:tc>
+          <w:tcPr>
+            <w:tcW w:type="dxa" w:w="1512"/>
+            <w:vAlign w:val="center"/>
+            <w:tcBorders>
+              <w:top w:val="single" w:sz="4" w:color="D9D9D9"/>
+              <w:left w:val="single" w:sz="4" w:color="D9D9D9"/>
+              <w:bottom w:val="single" w:sz="4" w:color="D9D9D9"/>
+              <w:right w:val="single" w:sz="4" w:color="D9D9D9"/>
+            </w:tcBorders>
+            <w:tcMar>
+              <w:top w:w="70" w:type="dxa"/>
+              <w:left w:w="70" w:type="dxa"/>
+              <w:bottom w:w="70" w:type="dxa"/>
+              <w:right w:w="70" w:type="dxa"/>
+            </w:tcMar>
+          </w:tcPr>
+          <w:p>
+            <w:pPr>
+              <w:spacing w:after="0" w:line="240" w:lineRule="auto"/>
+            </w:pPr>
+            <w:r>
+              <w:rPr>
+                <w:rFonts w:ascii="Calibri" w:hAnsi="Calibri"/>
+                <w:b w:val="0"/>
+                <w:sz w:val="20"/>
+              </w:rPr>
+              <w:t>SimpleRNN</w:t>
+            </w:r>
+          </w:p>
+        </w:tc>
+        <w:tc>
+          <w:tcPr>
+            <w:tcW w:type="dxa" w:w="864"/>
+            <w:vAlign w:val="center"/>
+            <w:tcBorders>
+              <w:top w:val="single" w:sz="4" w:color="D9D9D9"/>
+              <w:left w:val="single" w:sz="4" w:color="D9D9D9"/>
+              <w:bottom w:val="single" w:sz="4" w:color="D9D9D9"/>
+              <w:right w:val="single" w:sz="4" w:color="D9D9D9"/>
+            </w:tcBorders>
+            <w:tcMar>
+              <w:top w:w="70" w:type="dxa"/>
+              <w:left w:w="70" w:type="dxa"/>
+              <w:bottom w:w="70" w:type="dxa"/>
+              <w:right w:w="70" w:type="dxa"/>
+            </w:tcMar>
+          </w:tcPr>
+          <w:p>
+            <w:pPr>
+              <w:spacing w:after="0" w:line="240" w:lineRule="auto"/>
+            </w:pPr>
+            <w:r>
+              <w:rPr>
+                <w:rFonts w:ascii="Calibri" w:hAnsi="Calibri"/>
+                <w:b w:val="0"/>
+                <w:sz w:val="20"/>
+              </w:rPr>
+              <w:t>1</w:t>
+            </w:r>
+          </w:p>
+        </w:tc>
+        <w:tc>
+          <w:tcPr>
+            <w:tcW w:type="dxa" w:w="864"/>
+            <w:vAlign w:val="center"/>
+            <w:tcBorders>
+              <w:top w:val="single" w:sz="4" w:color="D9D9D9"/>
+              <w:left w:val="single" w:sz="4" w:color="D9D9D9"/>
+              <w:bottom w:val="single" w:sz="4" w:color="D9D9D9"/>
+              <w:right w:val="single" w:sz="4" w:color="D9D9D9"/>
+            </w:tcBorders>
+            <w:tcMar>
+              <w:top w:w="70" w:type="dxa"/>
+              <w:left w:w="70" w:type="dxa"/>
+              <w:bottom w:w="70" w:type="dxa"/>
+              <w:right w:w="70" w:type="dxa"/>
+            </w:tcMar>
+          </w:tcPr>
+          <w:p>
+            <w:pPr>
+              <w:spacing w:after="0" w:line="240" w:lineRule="auto"/>
+            </w:pPr>
+            <w:r>
+              <w:rPr>
+                <w:rFonts w:ascii="Calibri" w:hAnsi="Calibri"/>
+                <w:b w:val="0"/>
+                <w:sz w:val="20"/>
+              </w:rPr>
+              <w:t>4</w:t>
+            </w:r>
+          </w:p>
+        </w:tc>
+        <w:tc>
+          <w:tcPr>
+            <w:tcW w:type="dxa" w:w="2592"/>
+            <w:vAlign w:val="center"/>
+            <w:tcBorders>
+              <w:top w:val="single" w:sz="4" w:color="D9D9D9"/>
+              <w:left w:val="single" w:sz="4" w:color="D9D9D9"/>
+              <w:bottom w:val="single" w:sz="4" w:color="D9D9D9"/>
+              <w:right w:val="single" w:sz="4" w:color="D9D9D9"/>
+            </w:tcBorders>
+            <w:tcMar>
+              <w:top w:w="70" w:type="dxa"/>
+              <w:left w:w="70" w:type="dxa"/>
+              <w:bottom w:w="70" w:type="dxa"/>
+              <w:right w:w="70" w:type="dxa"/>
+            </w:tcMar>
+          </w:tcPr>
+          <w:p>
+            <w:pPr>
+              <w:spacing w:after="0" w:line="240" w:lineRule="auto"/>
+            </w:pPr>
+            <w:r>
+              <w:rPr>
+                <w:rFonts w:ascii="Calibri" w:hAnsi="Calibri"/>
+                <w:b w:val="0"/>
+                <w:sz w:val="20"/>
+              </w:rPr>
+              <w:t>87.72%</w:t>
+            </w:r>
+          </w:p>
+        </w:tc>
+        <w:tc>
+          <w:tcPr>
+            <w:tcW w:type="dxa" w:w="2448"/>
+            <w:vAlign w:val="center"/>
+            <w:tcBorders>
+              <w:top w:val="single" w:sz="4" w:color="D9D9D9"/>
+              <w:left w:val="single" w:sz="4" w:color="D9D9D9"/>
+              <w:bottom w:val="single" w:sz="4" w:color="D9D9D9"/>
+              <w:right w:val="single" w:sz="4" w:color="D9D9D9"/>
+            </w:tcBorders>
+            <w:tcMar>
+              <w:top w:w="70" w:type="dxa"/>
+              <w:left w:w="70" w:type="dxa"/>
+              <w:bottom w:w="70" w:type="dxa"/>
+              <w:right w:w="70" w:type="dxa"/>
+            </w:tcMar>
+          </w:tcPr>
+          <w:p>
+            <w:pPr>
+              <w:spacing w:after="0" w:line="240" w:lineRule="auto"/>
+            </w:pPr>
+            <w:r>
+              <w:rPr>
+                <w:rFonts w:ascii="Calibri" w:hAnsi="Calibri"/>
+                <w:b w:val="0"/>
+                <w:sz w:val="20"/>
+              </w:rPr>
+              <w:t>0.3522</w:t>
+            </w:r>
+          </w:p>
+        </w:tc>
+      </w:tr>
+      <w:tr>
+        <w:trPr>
+          <w:cantSplit/>
+        </w:trPr>
+        <w:tc>
+          <w:tcPr>
+            <w:tcW w:type="dxa" w:w="1512"/>
+            <w:vAlign w:val="center"/>
+            <w:tcBorders>
+              <w:top w:val="single" w:sz="4" w:color="D9D9D9"/>
+              <w:left w:val="single" w:sz="4" w:color="D9D9D9"/>
+              <w:bottom w:val="single" w:sz="4" w:color="D9D9D9"/>
+              <w:right w:val="single" w:sz="4" w:color="D9D9D9"/>
+            </w:tcBorders>
+            <w:tcMar>
+              <w:top w:w="70" w:type="dxa"/>
+              <w:left w:w="70" w:type="dxa"/>
+              <w:bottom w:w="70" w:type="dxa"/>
+              <w:right w:w="70" w:type="dxa"/>
+            </w:tcMar>
+          </w:tcPr>
+          <w:p>
+            <w:pPr>
+              <w:spacing w:after="0" w:line="240" w:lineRule="auto"/>
+            </w:pPr>
+            <w:r>
+              <w:rPr>
+                <w:rFonts w:ascii="Calibri" w:hAnsi="Calibri"/>
+                <w:b w:val="0"/>
+                <w:sz w:val="20"/>
+              </w:rPr>
+              <w:t>GRU</w:t>
+            </w:r>
+          </w:p>
+        </w:tc>
+        <w:tc>
+          <w:tcPr>
+            <w:tcW w:type="dxa" w:w="864"/>
+            <w:vAlign w:val="center"/>
+            <w:tcBorders>
+              <w:top w:val="single" w:sz="4" w:color="D9D9D9"/>
+              <w:left w:val="single" w:sz="4" w:color="D9D9D9"/>
+              <w:bottom w:val="single" w:sz="4" w:color="D9D9D9"/>
+              <w:right w:val="single" w:sz="4" w:color="D9D9D9"/>
+            </w:tcBorders>
+            <w:tcMar>
+              <w:top w:w="70" w:type="dxa"/>
+              <w:left w:w="70" w:type="dxa"/>
+              <w:bottom w:w="70" w:type="dxa"/>
+              <w:right w:w="70" w:type="dxa"/>
+            </w:tcMar>
+          </w:tcPr>
+          <w:p>
+            <w:pPr>
+              <w:spacing w:after="0" w:line="240" w:lineRule="auto"/>
+            </w:pPr>
+            <w:r>
+              <w:rPr>
+                <w:rFonts w:ascii="Calibri" w:hAnsi="Calibri"/>
+                <w:b w:val="0"/>
+                <w:sz w:val="20"/>
+              </w:rPr>
+              <w:t>3</w:t>
+            </w:r>
+          </w:p>
+        </w:tc>
+        <w:tc>
+          <w:tcPr>
+            <w:tcW w:type="dxa" w:w="864"/>
+            <w:vAlign w:val="center"/>
+            <w:tcBorders>
+              <w:top w:val="single" w:sz="4" w:color="D9D9D9"/>
+              <w:left w:val="single" w:sz="4" w:color="D9D9D9"/>
+              <w:bottom w:val="single" w:sz="4" w:color="D9D9D9"/>
+              <w:right w:val="single" w:sz="4" w:color="D9D9D9"/>
+            </w:tcBorders>
+            <w:tcMar>
+              <w:top w:w="70" w:type="dxa"/>
+              <w:left w:w="70" w:type="dxa"/>
+              <w:bottom w:w="70" w:type="dxa"/>
+              <w:right w:w="70" w:type="dxa"/>
+            </w:tcMar>
+          </w:tcPr>
+          <w:p>
+            <w:pPr>
+              <w:spacing w:after="0" w:line="240" w:lineRule="auto"/>
+            </w:pPr>
+            <w:r>
+              <w:rPr>
+                <w:rFonts w:ascii="Calibri" w:hAnsi="Calibri"/>
+                <w:b w:val="0"/>
+                <w:sz w:val="20"/>
+              </w:rPr>
+              <w:t>3</w:t>
+            </w:r>
+          </w:p>
+        </w:tc>
+        <w:tc>
+          <w:tcPr>
+            <w:tcW w:type="dxa" w:w="2592"/>
+            <w:vAlign w:val="center"/>
+            <w:tcBorders>
+              <w:top w:val="single" w:sz="4" w:color="D9D9D9"/>
+              <w:left w:val="single" w:sz="4" w:color="D9D9D9"/>
+              <w:bottom w:val="single" w:sz="4" w:color="D9D9D9"/>
+              <w:right w:val="single" w:sz="4" w:color="D9D9D9"/>
+            </w:tcBorders>
+            <w:tcMar>
+              <w:top w:w="70" w:type="dxa"/>
+              <w:left w:w="70" w:type="dxa"/>
+              <w:bottom w:w="70" w:type="dxa"/>
+              <w:right w:w="70" w:type="dxa"/>
+            </w:tcMar>
+          </w:tcPr>
+          <w:p>
+            <w:pPr>
+              <w:spacing w:after="0" w:line="240" w:lineRule="auto"/>
+            </w:pPr>
+            <w:r>
+              <w:rPr>
+                <w:rFonts w:ascii="Calibri" w:hAnsi="Calibri"/>
+                <w:b w:val="0"/>
+                <w:sz w:val="20"/>
+              </w:rPr>
+              <w:t>89.38%</w:t>
+            </w:r>
+          </w:p>
+        </w:tc>
+        <w:tc>
+          <w:tcPr>
+            <w:tcW w:type="dxa" w:w="2448"/>
+            <w:vAlign w:val="center"/>
+            <w:tcBorders>
+              <w:top w:val="single" w:sz="4" w:color="D9D9D9"/>
+              <w:left w:val="single" w:sz="4" w:color="D9D9D9"/>
+              <w:bottom w:val="single" w:sz="4" w:color="D9D9D9"/>
+              <w:right w:val="single" w:sz="4" w:color="D9D9D9"/>
+            </w:tcBorders>
+            <w:tcMar>
+              <w:top w:w="70" w:type="dxa"/>
+              <w:left w:w="70" w:type="dxa"/>
+              <w:bottom w:w="70" w:type="dxa"/>
+              <w:right w:w="70" w:type="dxa"/>
+            </w:tcMar>
+          </w:tcPr>
+          <w:p>
+            <w:pPr>
+              <w:spacing w:after="0" w:line="240" w:lineRule="auto"/>
+            </w:pPr>
+            <w:r>
+              <w:rPr>
+                <w:rFonts w:ascii="Calibri" w:hAnsi="Calibri"/>
+                <w:b w:val="0"/>
+                <w:sz w:val="20"/>
+              </w:rPr>
+              <w:t>0.2724</w:t>
+            </w:r>
+          </w:p>
+        </w:tc>
+      </w:tr>
+      <w:tr>
+        <w:trPr>
+          <w:cantSplit/>
+        </w:trPr>
+        <w:tc>
+          <w:tcPr>
+            <w:tcW w:type="dxa" w:w="1512"/>
+            <w:vAlign w:val="center"/>
+            <w:tcBorders>
+              <w:top w:val="single" w:sz="4" w:color="D9D9D9"/>
+              <w:left w:val="single" w:sz="4" w:color="D9D9D9"/>
+              <w:bottom w:val="single" w:sz="4" w:color="D9D9D9"/>
+              <w:right w:val="single" w:sz="4" w:color="D9D9D9"/>
+            </w:tcBorders>
+            <w:tcMar>
+              <w:top w:w="70" w:type="dxa"/>
+              <w:left w:w="70" w:type="dxa"/>
+              <w:bottom w:w="70" w:type="dxa"/>
+              <w:right w:w="70" w:type="dxa"/>
+            </w:tcMar>
+          </w:tcPr>
+          <w:p>
+            <w:pPr>
+              <w:spacing w:after="0" w:line="240" w:lineRule="auto"/>
+            </w:pPr>
+            <w:r>
+              <w:rPr>
+                <w:rFonts w:ascii="Calibri" w:hAnsi="Calibri"/>
+                <w:b w:val="0"/>
+                <w:sz w:val="20"/>
+              </w:rPr>
+              <w:t>LSTM</w:t>
+            </w:r>
+          </w:p>
+        </w:tc>
+        <w:tc>
+          <w:tcPr>
+            <w:tcW w:type="dxa" w:w="864"/>
+            <w:vAlign w:val="center"/>
+            <w:tcBorders>
+              <w:top w:val="single" w:sz="4" w:color="D9D9D9"/>
+              <w:left w:val="single" w:sz="4" w:color="D9D9D9"/>
+              <w:bottom w:val="single" w:sz="4" w:color="D9D9D9"/>
+              <w:right w:val="single" w:sz="4" w:color="D9D9D9"/>
+            </w:tcBorders>
+            <w:tcMar>
+              <w:top w:w="70" w:type="dxa"/>
+              <w:left w:w="70" w:type="dxa"/>
+              <w:bottom w:w="70" w:type="dxa"/>
+              <w:right w:w="70" w:type="dxa"/>
+            </w:tcMar>
+          </w:tcPr>
+          <w:p>
+            <w:pPr>
+              <w:spacing w:after="0" w:line="240" w:lineRule="auto"/>
+            </w:pPr>
+            <w:r>
+              <w:rPr>
+                <w:rFonts w:ascii="Calibri" w:hAnsi="Calibri"/>
+                <w:b w:val="0"/>
+                <w:sz w:val="20"/>
+              </w:rPr>
+              <w:t>2</w:t>
+            </w:r>
+          </w:p>
+        </w:tc>
+        <w:tc>
+          <w:tcPr>
+            <w:tcW w:type="dxa" w:w="864"/>
+            <w:vAlign w:val="center"/>
+            <w:tcBorders>
+              <w:top w:val="single" w:sz="4" w:color="D9D9D9"/>
+              <w:left w:val="single" w:sz="4" w:color="D9D9D9"/>
+              <w:bottom w:val="single" w:sz="4" w:color="D9D9D9"/>
+              <w:right w:val="single" w:sz="4" w:color="D9D9D9"/>
+            </w:tcBorders>
+            <w:tcMar>
+              <w:top w:w="70" w:type="dxa"/>
+              <w:left w:w="70" w:type="dxa"/>
+              <w:bottom w:w="70" w:type="dxa"/>
+              <w:right w:w="70" w:type="dxa"/>
+            </w:tcMar>
+          </w:tcPr>
+          <w:p>
+            <w:pPr>
+              <w:spacing w:after="0" w:line="240" w:lineRule="auto"/>
+            </w:pPr>
+            <w:r>
+              <w:rPr>
+                <w:rFonts w:ascii="Calibri" w:hAnsi="Calibri"/>
+                <w:b w:val="0"/>
+                <w:sz w:val="20"/>
+              </w:rPr>
+              <w:t>2</w:t>
+            </w:r>
+          </w:p>
+        </w:tc>
+        <w:tc>
+          <w:tcPr>
+            <w:tcW w:type="dxa" w:w="2592"/>
+            <w:vAlign w:val="center"/>
+            <w:tcBorders>
+              <w:top w:val="single" w:sz="4" w:color="D9D9D9"/>
+              <w:left w:val="single" w:sz="4" w:color="D9D9D9"/>
+              <w:bottom w:val="single" w:sz="4" w:color="D9D9D9"/>
+              <w:right w:val="single" w:sz="4" w:color="D9D9D9"/>
+            </w:tcBorders>
+            <w:tcMar>
+              <w:top w:w="70" w:type="dxa"/>
+              <w:left w:w="70" w:type="dxa"/>
+              <w:bottom w:w="70" w:type="dxa"/>
+              <w:right w:w="70" w:type="dxa"/>
+            </w:tcMar>
+          </w:tcPr>
+          <w:p>
+            <w:pPr>
+              <w:spacing w:after="0" w:line="240" w:lineRule="auto"/>
+            </w:pPr>
+            <w:r>
+              <w:rPr>
+                <w:rFonts w:ascii="Calibri" w:hAnsi="Calibri"/>
+                <w:b w:val="0"/>
+                <w:sz w:val="20"/>
+              </w:rPr>
+              <w:t>88.90%</w:t>
+            </w:r>
+          </w:p>
+        </w:tc>
+        <w:tc>
+          <w:tcPr>
+            <w:tcW w:type="dxa" w:w="2448"/>
+            <w:vAlign w:val="center"/>
+            <w:tcBorders>
+              <w:top w:val="single" w:sz="4" w:color="D9D9D9"/>
+              <w:left w:val="single" w:sz="4" w:color="D9D9D9"/>
+              <w:bottom w:val="single" w:sz="4" w:color="D9D9D9"/>
+              <w:right w:val="single" w:sz="4" w:color="D9D9D9"/>
+            </w:tcBorders>
+            <w:tcMar>
+              <w:top w:w="70" w:type="dxa"/>
+              <w:left w:w="70" w:type="dxa"/>
+              <w:bottom w:w="70" w:type="dxa"/>
+              <w:right w:w="70" w:type="dxa"/>
+            </w:tcMar>
+          </w:tcPr>
+          <w:p>
+            <w:pPr>
+              <w:spacing w:after="0" w:line="240" w:lineRule="auto"/>
+            </w:pPr>
+            <w:r>
+              <w:rPr>
+                <w:rFonts w:ascii="Calibri" w:hAnsi="Calibri"/>
+                <w:b w:val="0"/>
+                <w:sz w:val="20"/>
+              </w:rPr>
+              <w:t>0.2727</w:t>
+            </w:r>
+          </w:p>
+        </w:tc>
+      </w:tr>
+    </w:tbl>
+    <w:p>
+      <w:pPr>
+        <w:spacing w:after="140" w:line="254" w:lineRule="auto"/>
+      </w:pPr>
+      <w:r>
+        <w:rPr>
+          <w:rFonts w:ascii="Calibri" w:hAnsi="Calibri"/>
+          <w:b w:val="0"/>
+          <w:sz w:val="22"/>
+        </w:rPr>
+        <w:t>Each row shows the highest validation accuracy in that family and the loss measured at the same epoch. It does not combine accuracy from one epoch with loss from another. For SimpleRNN, its lowest loss was instead 0.3248 at epoch 3, with 86.42% accuracy. The two class labels remain negative and positive; layers describe the depth of the network.</w:t>
+      </w:r>
+    </w:p>
+    <w:p>
+      <w:pPr>
+        <w:keepNext/>
+        <w:spacing w:after="140" w:line="254" w:lineRule="auto"/>
+      </w:pPr>
+      <w:r>
+        <w:rPr>
+          <w:rFonts w:ascii="Calibri" w:hAnsi="Calibri"/>
+          <w:b/>
+          <w:sz w:val="22"/>
+        </w:rPr>
+        <w:t>Main values shared by all experiments</w:t>
+      </w:r>
+    </w:p>
+    <w:tbl>
+      <w:tblPr>
+        <w:tblW w:type="auto" w:w="0"/>
+        <w:tblLayout w:type="fixed"/>
+        <w:tblLook w:firstColumn="1" w:firstRow="1" w:lastColumn="0" w:lastRow="0" w:noHBand="0" w:noVBand="1" w:val="04A0"/>
+      </w:tblPr>
+      <w:tblGrid>
+        <w:gridCol w:w="1656"/>
+        <w:gridCol w:w="2664"/>
+        <w:gridCol w:w="4565"/>
+      </w:tblGrid>
+      <w:tr>
+        <w:trPr>
+          <w:cantSplit/>
+          <w:tblHeader/>
+        </w:trPr>
+        <w:tc>
+          <w:tcPr>
+            <w:tcW w:type="dxa" w:w="1656"/>
+            <w:vAlign w:val="center"/>
+            <w:tcBorders>
+              <w:top w:val="single" w:sz="4" w:color="D9D9D9"/>
+              <w:left w:val="single" w:sz="4" w:color="D9D9D9"/>
+              <w:bottom w:val="single" w:sz="4" w:color="D9D9D9"/>
+              <w:right w:val="single" w:sz="4" w:color="D9D9D9"/>
+            </w:tcBorders>
+            <w:tcMar>
+              <w:top w:w="70" w:type="dxa"/>
+              <w:left w:w="70" w:type="dxa"/>
+              <w:bottom w:w="70" w:type="dxa"/>
+              <w:right w:w="70" w:type="dxa"/>
+            </w:tcMar>
+            <w:shd w:fill="E7EDF3"/>
+          </w:tcPr>
+          <w:p>
+            <w:pPr>
+              <w:spacing w:after="0" w:line="240" w:lineRule="auto"/>
+            </w:pPr>
+            <w:r>
+              <w:rPr>
+                <w:rFonts w:ascii="Calibri" w:hAnsi="Calibri"/>
+                <w:b/>
+                <w:sz w:val="20"/>
+              </w:rPr>
+              <w:t>Setting</w:t>
+            </w:r>
+          </w:p>
+        </w:tc>
+        <w:tc>
+          <w:tcPr>
+            <w:tcW w:type="dxa" w:w="2664"/>
+            <w:vAlign w:val="center"/>
+            <w:tcBorders>
+              <w:top w:val="single" w:sz="4" w:color="D9D9D9"/>
+              <w:left w:val="single" w:sz="4" w:color="D9D9D9"/>
+              <w:bottom w:val="single" w:sz="4" w:color="D9D9D9"/>
+              <w:right w:val="single" w:sz="4" w:color="D9D9D9"/>
+            </w:tcBorders>
+            <w:tcMar>
+              <w:top w:w="70" w:type="dxa"/>
+              <w:left w:w="70" w:type="dxa"/>
+              <w:bottom w:w="70" w:type="dxa"/>
+              <w:right w:w="70" w:type="dxa"/>
+            </w:tcMar>
+            <w:shd w:fill="E7EDF3"/>
+          </w:tcPr>
+          <w:p>
+            <w:pPr>
+              <w:spacing w:after="0" w:line="240" w:lineRule="auto"/>
+            </w:pPr>
+            <w:r>
+              <w:rPr>
+                <w:rFonts w:ascii="Calibri" w:hAnsi="Calibri"/>
+                <w:b/>
+                <w:sz w:val="20"/>
+              </w:rPr>
+              <w:t>Value</w:t>
+            </w:r>
+          </w:p>
+        </w:tc>
+        <w:tc>
+          <w:tcPr>
+            <w:tcW w:type="dxa" w:w="4565"/>
+            <w:vAlign w:val="center"/>
+            <w:tcBorders>
+              <w:top w:val="single" w:sz="4" w:color="D9D9D9"/>
+              <w:left w:val="single" w:sz="4" w:color="D9D9D9"/>
+              <w:bottom w:val="single" w:sz="4" w:color="D9D9D9"/>
+              <w:right w:val="single" w:sz="4" w:color="D9D9D9"/>
+            </w:tcBorders>
+            <w:tcMar>
+              <w:top w:w="70" w:type="dxa"/>
+              <w:left w:w="70" w:type="dxa"/>
+              <w:bottom w:w="70" w:type="dxa"/>
+              <w:right w:w="70" w:type="dxa"/>
+            </w:tcMar>
+            <w:shd w:fill="E7EDF3"/>
+          </w:tcPr>
+          <w:p>
+            <w:pPr>
+              <w:spacing w:after="0" w:line="240" w:lineRule="auto"/>
+            </w:pPr>
+            <w:r>
+              <w:rPr>
+                <w:rFonts w:ascii="Calibri" w:hAnsi="Calibri"/>
+                <w:b/>
+                <w:sz w:val="20"/>
+              </w:rPr>
+              <w:t>Purpose</w:t>
+            </w:r>
+          </w:p>
+        </w:tc>
+      </w:tr>
+      <w:tr>
+        <w:trPr>
+          <w:cantSplit/>
+        </w:trPr>
+        <w:tc>
+          <w:tcPr>
+            <w:tcW w:type="dxa" w:w="1656"/>
+            <w:vAlign w:val="center"/>
+            <w:tcBorders>
+              <w:top w:val="single" w:sz="4" w:color="D9D9D9"/>
+              <w:left w:val="single" w:sz="4" w:color="D9D9D9"/>
+              <w:bottom w:val="single" w:sz="4" w:color="D9D9D9"/>
+              <w:right w:val="single" w:sz="4" w:color="D9D9D9"/>
+            </w:tcBorders>
+            <w:tcMar>
+              <w:top w:w="70" w:type="dxa"/>
+              <w:left w:w="70" w:type="dxa"/>
+              <w:bottom w:w="70" w:type="dxa"/>
+              <w:right w:w="70" w:type="dxa"/>
+            </w:tcMar>
+          </w:tcPr>
+          <w:p>
+            <w:pPr>
+              <w:spacing w:after="0" w:line="240" w:lineRule="auto"/>
+            </w:pPr>
+            <w:r>
+              <w:rPr>
+                <w:rFonts w:ascii="Calibri" w:hAnsi="Calibri"/>
+                <w:b w:val="0"/>
+                <w:sz w:val="20"/>
+              </w:rPr>
+              <w:t>Data split</w:t>
+            </w:r>
+          </w:p>
+        </w:tc>
+        <w:tc>
+          <w:tcPr>
+            <w:tcW w:type="dxa" w:w="2664"/>
+            <w:vAlign w:val="center"/>
+            <w:tcBorders>
+              <w:top w:val="single" w:sz="4" w:color="D9D9D9"/>
+              <w:left w:val="single" w:sz="4" w:color="D9D9D9"/>
+              <w:bottom w:val="single" w:sz="4" w:color="D9D9D9"/>
+              <w:right w:val="single" w:sz="4" w:color="D9D9D9"/>
+            </w:tcBorders>
+            <w:tcMar>
+              <w:top w:w="70" w:type="dxa"/>
+              <w:left w:w="70" w:type="dxa"/>
+              <w:bottom w:w="70" w:type="dxa"/>
+              <w:right w:w="70" w:type="dxa"/>
+            </w:tcMar>
+          </w:tcPr>
+          <w:p>
+            <w:pPr>
+              <w:spacing w:after="0" w:line="240" w:lineRule="auto"/>
+            </w:pPr>
+            <w:r>
+              <w:rPr>
+                <w:rFonts w:ascii="Calibri" w:hAnsi="Calibri"/>
+                <w:b w:val="0"/>
+                <w:sz w:val="20"/>
+              </w:rPr>
+              <w:t>70% / 10% / 20%</w:t>
+            </w:r>
+          </w:p>
+        </w:tc>
+        <w:tc>
+          <w:tcPr>
+            <w:tcW w:type="dxa" w:w="4565"/>
+            <w:vAlign w:val="center"/>
+            <w:tcBorders>
+              <w:top w:val="single" w:sz="4" w:color="D9D9D9"/>
+              <w:left w:val="single" w:sz="4" w:color="D9D9D9"/>
+              <w:bottom w:val="single" w:sz="4" w:color="D9D9D9"/>
+              <w:right w:val="single" w:sz="4" w:color="D9D9D9"/>
+            </w:tcBorders>
+            <w:tcMar>
+              <w:top w:w="70" w:type="dxa"/>
+              <w:left w:w="70" w:type="dxa"/>
+              <w:bottom w:w="70" w:type="dxa"/>
+              <w:right w:w="70" w:type="dxa"/>
+            </w:tcMar>
+          </w:tcPr>
+          <w:p>
+            <w:pPr>
+              <w:spacing w:after="0" w:line="240" w:lineRule="auto"/>
+            </w:pPr>
+            <w:r>
+              <w:rPr>
+                <w:rFonts w:ascii="Calibri" w:hAnsi="Calibri"/>
+                <w:b w:val="0"/>
+                <w:sz w:val="20"/>
+              </w:rPr>
+              <w:t>35,000 training, 5,000 validation and 10,000 test reviews; balanced classes and seed 42.</w:t>
+            </w:r>
+          </w:p>
+        </w:tc>
+      </w:tr>
+      <w:tr>
+        <w:trPr>
+          <w:cantSplit/>
+        </w:trPr>
+        <w:tc>
+          <w:tcPr>
+            <w:tcW w:type="dxa" w:w="1656"/>
+            <w:vAlign w:val="center"/>
+            <w:tcBorders>
+              <w:top w:val="single" w:sz="4" w:color="D9D9D9"/>
+              <w:left w:val="single" w:sz="4" w:color="D9D9D9"/>
+              <w:bottom w:val="single" w:sz="4" w:color="D9D9D9"/>
+              <w:right w:val="single" w:sz="4" w:color="D9D9D9"/>
+            </w:tcBorders>
+            <w:tcMar>
+              <w:top w:w="70" w:type="dxa"/>
+              <w:left w:w="70" w:type="dxa"/>
+              <w:bottom w:w="70" w:type="dxa"/>
+              <w:right w:w="70" w:type="dxa"/>
+            </w:tcMar>
+          </w:tcPr>
+          <w:p>
+            <w:pPr>
+              <w:spacing w:after="0" w:line="240" w:lineRule="auto"/>
+            </w:pPr>
+            <w:r>
+              <w:rPr>
+                <w:rFonts w:ascii="Calibri" w:hAnsi="Calibri"/>
+                <w:b w:val="0"/>
+                <w:sz w:val="20"/>
+              </w:rPr>
+              <w:t>Input</w:t>
+            </w:r>
+          </w:p>
+        </w:tc>
+        <w:tc>
+          <w:tcPr>
+            <w:tcW w:type="dxa" w:w="2664"/>
+            <w:vAlign w:val="center"/>
+            <w:tcBorders>
+              <w:top w:val="single" w:sz="4" w:color="D9D9D9"/>
+              <w:left w:val="single" w:sz="4" w:color="D9D9D9"/>
+              <w:bottom w:val="single" w:sz="4" w:color="D9D9D9"/>
+              <w:right w:val="single" w:sz="4" w:color="D9D9D9"/>
+            </w:tcBorders>
+            <w:tcMar>
+              <w:top w:w="70" w:type="dxa"/>
+              <w:left w:w="70" w:type="dxa"/>
+              <w:bottom w:w="70" w:type="dxa"/>
+              <w:right w:w="70" w:type="dxa"/>
+            </w:tcMar>
+          </w:tcPr>
+          <w:p>
+            <w:pPr>
+              <w:spacing w:after="0" w:line="240" w:lineRule="auto"/>
+            </w:pPr>
+            <w:r>
+              <w:rPr>
+                <w:rFonts w:ascii="Calibri" w:hAnsi="Calibri"/>
+                <w:b w:val="0"/>
+                <w:sz w:val="20"/>
+              </w:rPr>
+              <w:t>10,000 IDs; 500 tokens</w:t>
+            </w:r>
+          </w:p>
+        </w:tc>
+        <w:tc>
+          <w:tcPr>
+            <w:tcW w:type="dxa" w:w="4565"/>
+            <w:vAlign w:val="center"/>
+            <w:tcBorders>
+              <w:top w:val="single" w:sz="4" w:color="D9D9D9"/>
+              <w:left w:val="single" w:sz="4" w:color="D9D9D9"/>
+              <w:bottom w:val="single" w:sz="4" w:color="D9D9D9"/>
+              <w:right w:val="single" w:sz="4" w:color="D9D9D9"/>
+            </w:tcBorders>
+            <w:tcMar>
+              <w:top w:w="70" w:type="dxa"/>
+              <w:left w:w="70" w:type="dxa"/>
+              <w:bottom w:w="70" w:type="dxa"/>
+              <w:right w:w="70" w:type="dxa"/>
+            </w:tcMar>
+          </w:tcPr>
+          <w:p>
+            <w:pPr>
+              <w:spacing w:after="0" w:line="240" w:lineRule="auto"/>
+            </w:pPr>
+            <w:r>
+              <w:rPr>
+                <w:rFonts w:ascii="Calibri" w:hAnsi="Calibri"/>
+                <w:b w:val="0"/>
+                <w:sz w:val="20"/>
+              </w:rPr>
+              <w:t>Uses the assignment vocabulary limit and review length; retains the last 500 tokens.</w:t>
+            </w:r>
+          </w:p>
+        </w:tc>
+      </w:tr>
+      <w:tr>
+        <w:trPr>
+          <w:cantSplit/>
+        </w:trPr>
+        <w:tc>
+          <w:tcPr>
+            <w:tcW w:type="dxa" w:w="1656"/>
+            <w:vAlign w:val="center"/>
+            <w:tcBorders>
+              <w:top w:val="single" w:sz="4" w:color="D9D9D9"/>
+              <w:left w:val="single" w:sz="4" w:color="D9D9D9"/>
+              <w:bottom w:val="single" w:sz="4" w:color="D9D9D9"/>
+              <w:right w:val="single" w:sz="4" w:color="D9D9D9"/>
+            </w:tcBorders>
+            <w:tcMar>
+              <w:top w:w="70" w:type="dxa"/>
+              <w:left w:w="70" w:type="dxa"/>
+              <w:bottom w:w="70" w:type="dxa"/>
+              <w:right w:w="70" w:type="dxa"/>
+            </w:tcMar>
+          </w:tcPr>
+          <w:p>
+            <w:pPr>
+              <w:spacing w:after="0" w:line="240" w:lineRule="auto"/>
+            </w:pPr>
+            <w:r>
+              <w:rPr>
+                <w:rFonts w:ascii="Calibri" w:hAnsi="Calibri"/>
+                <w:b w:val="0"/>
+                <w:sz w:val="20"/>
+              </w:rPr>
+              <w:t>Embedding</w:t>
+            </w:r>
+          </w:p>
+        </w:tc>
+        <w:tc>
+          <w:tcPr>
+            <w:tcW w:type="dxa" w:w="2664"/>
+            <w:vAlign w:val="center"/>
+            <w:tcBorders>
+              <w:top w:val="single" w:sz="4" w:color="D9D9D9"/>
+              <w:left w:val="single" w:sz="4" w:color="D9D9D9"/>
+              <w:bottom w:val="single" w:sz="4" w:color="D9D9D9"/>
+              <w:right w:val="single" w:sz="4" w:color="D9D9D9"/>
+            </w:tcBorders>
+            <w:tcMar>
+              <w:top w:w="70" w:type="dxa"/>
+              <w:left w:w="70" w:type="dxa"/>
+              <w:bottom w:w="70" w:type="dxa"/>
+              <w:right w:w="70" w:type="dxa"/>
+            </w:tcMar>
+          </w:tcPr>
+          <w:p>
+            <w:pPr>
+              <w:spacing w:after="0" w:line="240" w:lineRule="auto"/>
+            </w:pPr>
+            <w:r>
+              <w:rPr>
+                <w:rFonts w:ascii="Calibri" w:hAnsi="Calibri"/>
+                <w:b w:val="0"/>
+                <w:sz w:val="20"/>
+              </w:rPr>
+              <w:t>32 dimensions</w:t>
+            </w:r>
+          </w:p>
+        </w:tc>
+        <w:tc>
+          <w:tcPr>
+            <w:tcW w:type="dxa" w:w="4565"/>
+            <w:vAlign w:val="center"/>
+            <w:tcBorders>
+              <w:top w:val="single" w:sz="4" w:color="D9D9D9"/>
+              <w:left w:val="single" w:sz="4" w:color="D9D9D9"/>
+              <w:bottom w:val="single" w:sz="4" w:color="D9D9D9"/>
+              <w:right w:val="single" w:sz="4" w:color="D9D9D9"/>
+            </w:tcBorders>
+            <w:tcMar>
+              <w:top w:w="70" w:type="dxa"/>
+              <w:left w:w="70" w:type="dxa"/>
+              <w:bottom w:w="70" w:type="dxa"/>
+              <w:right w:w="70" w:type="dxa"/>
+            </w:tcMar>
+          </w:tcPr>
+          <w:p>
+            <w:pPr>
+              <w:spacing w:after="0" w:line="240" w:lineRule="auto"/>
+            </w:pPr>
+            <w:r>
+              <w:rPr>
+                <w:rFonts w:ascii="Calibri" w:hAnsi="Calibri"/>
+                <w:b w:val="0"/>
+                <w:sz w:val="20"/>
+              </w:rPr>
+              <w:t>Learns a compact vector for each word ID; zero padding is masked.</w:t>
+            </w:r>
+          </w:p>
+        </w:tc>
+      </w:tr>
+      <w:tr>
+        <w:trPr>
+          <w:cantSplit/>
+        </w:trPr>
+        <w:tc>
+          <w:tcPr>
+            <w:tcW w:type="dxa" w:w="1656"/>
+            <w:vAlign w:val="center"/>
+            <w:tcBorders>
+              <w:top w:val="single" w:sz="4" w:color="D9D9D9"/>
+              <w:left w:val="single" w:sz="4" w:color="D9D9D9"/>
+              <w:bottom w:val="single" w:sz="4" w:color="D9D9D9"/>
+              <w:right w:val="single" w:sz="4" w:color="D9D9D9"/>
+            </w:tcBorders>
+            <w:tcMar>
+              <w:top w:w="70" w:type="dxa"/>
+              <w:left w:w="70" w:type="dxa"/>
+              <w:bottom w:w="70" w:type="dxa"/>
+              <w:right w:w="70" w:type="dxa"/>
+            </w:tcMar>
+          </w:tcPr>
+          <w:p>
+            <w:pPr>
+              <w:spacing w:after="0" w:line="240" w:lineRule="auto"/>
+            </w:pPr>
+            <w:r>
+              <w:rPr>
+                <w:rFonts w:ascii="Calibri" w:hAnsi="Calibri"/>
+                <w:b w:val="0"/>
+                <w:sz w:val="20"/>
+              </w:rPr>
+              <w:t>Recurrent layers</w:t>
+            </w:r>
+          </w:p>
+        </w:tc>
+        <w:tc>
+          <w:tcPr>
+            <w:tcW w:type="dxa" w:w="2664"/>
+            <w:vAlign w:val="center"/>
+            <w:tcBorders>
+              <w:top w:val="single" w:sz="4" w:color="D9D9D9"/>
+              <w:left w:val="single" w:sz="4" w:color="D9D9D9"/>
+              <w:bottom w:val="single" w:sz="4" w:color="D9D9D9"/>
+              <w:right w:val="single" w:sz="4" w:color="D9D9D9"/>
+            </w:tcBorders>
+            <w:tcMar>
+              <w:top w:w="70" w:type="dxa"/>
+              <w:left w:w="70" w:type="dxa"/>
+              <w:bottom w:w="70" w:type="dxa"/>
+              <w:right w:w="70" w:type="dxa"/>
+            </w:tcMar>
+          </w:tcPr>
+          <w:p>
+            <w:pPr>
+              <w:spacing w:after="0" w:line="240" w:lineRule="auto"/>
+            </w:pPr>
+            <w:r>
+              <w:rPr>
+                <w:rFonts w:ascii="Calibri" w:hAnsi="Calibri"/>
+                <w:b w:val="0"/>
+                <w:sz w:val="20"/>
+              </w:rPr>
+              <w:t>1, 2 or 3; 32 units each</w:t>
+            </w:r>
+          </w:p>
+        </w:tc>
+        <w:tc>
+          <w:tcPr>
+            <w:tcW w:type="dxa" w:w="4565"/>
+            <w:vAlign w:val="center"/>
+            <w:tcBorders>
+              <w:top w:val="single" w:sz="4" w:color="D9D9D9"/>
+              <w:left w:val="single" w:sz="4" w:color="D9D9D9"/>
+              <w:bottom w:val="single" w:sz="4" w:color="D9D9D9"/>
+              <w:right w:val="single" w:sz="4" w:color="D9D9D9"/>
+            </w:tcBorders>
+            <w:tcMar>
+              <w:top w:w="70" w:type="dxa"/>
+              <w:left w:w="70" w:type="dxa"/>
+              <w:bottom w:w="70" w:type="dxa"/>
+              <w:right w:w="70" w:type="dxa"/>
+            </w:tcMar>
+          </w:tcPr>
+          <w:p>
+            <w:pPr>
+              <w:spacing w:after="0" w:line="240" w:lineRule="auto"/>
+            </w:pPr>
+            <w:r>
+              <w:rPr>
+                <w:rFonts w:ascii="Calibri" w:hAnsi="Calibri"/>
+                <w:b w:val="0"/>
+                <w:sz w:val="20"/>
+              </w:rPr>
+              <w:t>Changes model type and depth while keeping the width fixed.</w:t>
+            </w:r>
+          </w:p>
+        </w:tc>
+      </w:tr>
+      <w:tr>
+        <w:trPr>
+          <w:cantSplit/>
+        </w:trPr>
+        <w:tc>
+          <w:tcPr>
+            <w:tcW w:type="dxa" w:w="1656"/>
+            <w:vAlign w:val="center"/>
+            <w:tcBorders>
+              <w:top w:val="single" w:sz="4" w:color="D9D9D9"/>
+              <w:left w:val="single" w:sz="4" w:color="D9D9D9"/>
+              <w:bottom w:val="single" w:sz="4" w:color="D9D9D9"/>
+              <w:right w:val="single" w:sz="4" w:color="D9D9D9"/>
+            </w:tcBorders>
+            <w:tcMar>
+              <w:top w:w="70" w:type="dxa"/>
+              <w:left w:w="70" w:type="dxa"/>
+              <w:bottom w:w="70" w:type="dxa"/>
+              <w:right w:w="70" w:type="dxa"/>
+            </w:tcMar>
+          </w:tcPr>
+          <w:p>
+            <w:pPr>
+              <w:spacing w:after="0" w:line="240" w:lineRule="auto"/>
+            </w:pPr>
+            <w:r>
+              <w:rPr>
+                <w:rFonts w:ascii="Calibri" w:hAnsi="Calibri"/>
+                <w:b w:val="0"/>
+                <w:sz w:val="20"/>
+              </w:rPr>
+              <w:t>Training</w:t>
+            </w:r>
+          </w:p>
+        </w:tc>
+        <w:tc>
+          <w:tcPr>
+            <w:tcW w:type="dxa" w:w="2664"/>
+            <w:vAlign w:val="center"/>
+            <w:tcBorders>
+              <w:top w:val="single" w:sz="4" w:color="D9D9D9"/>
+              <w:left w:val="single" w:sz="4" w:color="D9D9D9"/>
+              <w:bottom w:val="single" w:sz="4" w:color="D9D9D9"/>
+              <w:right w:val="single" w:sz="4" w:color="D9D9D9"/>
+            </w:tcBorders>
+            <w:tcMar>
+              <w:top w:w="70" w:type="dxa"/>
+              <w:left w:w="70" w:type="dxa"/>
+              <w:bottom w:w="70" w:type="dxa"/>
+              <w:right w:w="70" w:type="dxa"/>
+            </w:tcMar>
+          </w:tcPr>
+          <w:p>
+            <w:pPr>
+              <w:spacing w:after="0" w:line="240" w:lineRule="auto"/>
+            </w:pPr>
+            <w:r>
+              <w:rPr>
+                <w:rFonts w:ascii="Calibri" w:hAnsi="Calibri"/>
+                <w:b w:val="0"/>
+                <w:sz w:val="20"/>
+              </w:rPr>
+              <w:t>15 epochs; batch size 128</w:t>
+            </w:r>
+          </w:p>
+        </w:tc>
+        <w:tc>
+          <w:tcPr>
+            <w:tcW w:type="dxa" w:w="4565"/>
+            <w:vAlign w:val="center"/>
+            <w:tcBorders>
+              <w:top w:val="single" w:sz="4" w:color="D9D9D9"/>
+              <w:left w:val="single" w:sz="4" w:color="D9D9D9"/>
+              <w:bottom w:val="single" w:sz="4" w:color="D9D9D9"/>
+              <w:right w:val="single" w:sz="4" w:color="D9D9D9"/>
+            </w:tcBorders>
+            <w:tcMar>
+              <w:top w:w="70" w:type="dxa"/>
+              <w:left w:w="70" w:type="dxa"/>
+              <w:bottom w:w="70" w:type="dxa"/>
+              <w:right w:w="70" w:type="dxa"/>
+            </w:tcMar>
+          </w:tcPr>
+          <w:p>
+            <w:pPr>
+              <w:spacing w:after="0" w:line="240" w:lineRule="auto"/>
+            </w:pPr>
+            <w:r>
+              <w:rPr>
+                <w:rFonts w:ascii="Calibri" w:hAnsi="Calibri"/>
+                <w:b w:val="0"/>
+                <w:sz w:val="20"/>
+              </w:rPr>
+              <w:t>Gives every candidate the same epoch budget and batch size.</w:t>
+            </w:r>
+          </w:p>
+        </w:tc>
+      </w:tr>
+      <w:tr>
+        <w:trPr>
+          <w:cantSplit/>
+        </w:trPr>
+        <w:tc>
+          <w:tcPr>
+            <w:tcW w:type="dxa" w:w="1656"/>
+            <w:vAlign w:val="center"/>
+            <w:tcBorders>
+              <w:top w:val="single" w:sz="4" w:color="D9D9D9"/>
+              <w:left w:val="single" w:sz="4" w:color="D9D9D9"/>
+              <w:bottom w:val="single" w:sz="4" w:color="D9D9D9"/>
+              <w:right w:val="single" w:sz="4" w:color="D9D9D9"/>
+            </w:tcBorders>
+            <w:tcMar>
+              <w:top w:w="70" w:type="dxa"/>
+              <w:left w:w="70" w:type="dxa"/>
+              <w:bottom w:w="70" w:type="dxa"/>
+              <w:right w:w="70" w:type="dxa"/>
+            </w:tcMar>
+          </w:tcPr>
+          <w:p>
+            <w:pPr>
+              <w:spacing w:after="0" w:line="240" w:lineRule="auto"/>
+            </w:pPr>
+            <w:r>
+              <w:rPr>
+                <w:rFonts w:ascii="Calibri" w:hAnsi="Calibri"/>
+                <w:b w:val="0"/>
+                <w:sz w:val="20"/>
+              </w:rPr>
+              <w:t>Optimizer</w:t>
+            </w:r>
+          </w:p>
+        </w:tc>
+        <w:tc>
+          <w:tcPr>
+            <w:tcW w:type="dxa" w:w="2664"/>
+            <w:vAlign w:val="center"/>
+            <w:tcBorders>
+              <w:top w:val="single" w:sz="4" w:color="D9D9D9"/>
+              <w:left w:val="single" w:sz="4" w:color="D9D9D9"/>
+              <w:bottom w:val="single" w:sz="4" w:color="D9D9D9"/>
+              <w:right w:val="single" w:sz="4" w:color="D9D9D9"/>
+            </w:tcBorders>
+            <w:tcMar>
+              <w:top w:w="70" w:type="dxa"/>
+              <w:left w:w="70" w:type="dxa"/>
+              <w:bottom w:w="70" w:type="dxa"/>
+              <w:right w:w="70" w:type="dxa"/>
+            </w:tcMar>
+          </w:tcPr>
+          <w:p>
+            <w:pPr>
+              <w:spacing w:after="0" w:line="240" w:lineRule="auto"/>
+            </w:pPr>
+            <w:r>
+              <w:rPr>
+                <w:rFonts w:ascii="Calibri" w:hAnsi="Calibri"/>
+                <w:b w:val="0"/>
+                <w:sz w:val="20"/>
+              </w:rPr>
+              <w:t>Adam; learning rate 0.001</w:t>
+            </w:r>
+          </w:p>
+        </w:tc>
+        <w:tc>
+          <w:tcPr>
+            <w:tcW w:type="dxa" w:w="4565"/>
+            <w:vAlign w:val="center"/>
+            <w:tcBorders>
+              <w:top w:val="single" w:sz="4" w:color="D9D9D9"/>
+              <w:left w:val="single" w:sz="4" w:color="D9D9D9"/>
+              <w:bottom w:val="single" w:sz="4" w:color="D9D9D9"/>
+              <w:right w:val="single" w:sz="4" w:color="D9D9D9"/>
+            </w:tcBorders>
+            <w:tcMar>
+              <w:top w:w="70" w:type="dxa"/>
+              <w:left w:w="70" w:type="dxa"/>
+              <w:bottom w:w="70" w:type="dxa"/>
+              <w:right w:w="70" w:type="dxa"/>
+            </w:tcMar>
+          </w:tcPr>
+          <w:p>
+            <w:pPr>
+              <w:spacing w:after="0" w:line="240" w:lineRule="auto"/>
+            </w:pPr>
+            <w:r>
+              <w:rPr>
+                <w:rFonts w:ascii="Calibri" w:hAnsi="Calibri"/>
+                <w:b w:val="0"/>
+                <w:sz w:val="20"/>
+              </w:rPr>
+              <w:t>Uses adaptive weight updates with a conventional starting learning rate.</w:t>
+            </w:r>
+          </w:p>
+        </w:tc>
+      </w:tr>
+      <w:tr>
+        <w:trPr>
+          <w:cantSplit/>
+        </w:trPr>
+        <w:tc>
+          <w:tcPr>
+            <w:tcW w:type="dxa" w:w="1656"/>
+            <w:vAlign w:val="center"/>
+            <w:tcBorders>
+              <w:top w:val="single" w:sz="4" w:color="D9D9D9"/>
+              <w:left w:val="single" w:sz="4" w:color="D9D9D9"/>
+              <w:bottom w:val="single" w:sz="4" w:color="D9D9D9"/>
+              <w:right w:val="single" w:sz="4" w:color="D9D9D9"/>
+            </w:tcBorders>
+            <w:tcMar>
+              <w:top w:w="70" w:type="dxa"/>
+              <w:left w:w="70" w:type="dxa"/>
+              <w:bottom w:w="70" w:type="dxa"/>
+              <w:right w:w="70" w:type="dxa"/>
+            </w:tcMar>
+          </w:tcPr>
+          <w:p>
+            <w:pPr>
+              <w:spacing w:after="0" w:line="240" w:lineRule="auto"/>
+            </w:pPr>
+            <w:r>
+              <w:rPr>
+                <w:rFonts w:ascii="Calibri" w:hAnsi="Calibri"/>
+                <w:b w:val="0"/>
+                <w:sz w:val="20"/>
+              </w:rPr>
+              <w:t>Gradient clipping</w:t>
+            </w:r>
+          </w:p>
+        </w:tc>
+        <w:tc>
+          <w:tcPr>
+            <w:tcW w:type="dxa" w:w="2664"/>
+            <w:vAlign w:val="center"/>
+            <w:tcBorders>
+              <w:top w:val="single" w:sz="4" w:color="D9D9D9"/>
+              <w:left w:val="single" w:sz="4" w:color="D9D9D9"/>
+              <w:bottom w:val="single" w:sz="4" w:color="D9D9D9"/>
+              <w:right w:val="single" w:sz="4" w:color="D9D9D9"/>
+            </w:tcBorders>
+            <w:tcMar>
+              <w:top w:w="70" w:type="dxa"/>
+              <w:left w:w="70" w:type="dxa"/>
+              <w:bottom w:w="70" w:type="dxa"/>
+              <w:right w:w="70" w:type="dxa"/>
+            </w:tcMar>
+          </w:tcPr>
+          <w:p>
+            <w:pPr>
+              <w:spacing w:after="0" w:line="240" w:lineRule="auto"/>
+            </w:pPr>
+            <w:r>
+              <w:rPr>
+                <w:rFonts w:ascii="Calibri" w:hAnsi="Calibri"/>
+                <w:b w:val="0"/>
+                <w:sz w:val="20"/>
+              </w:rPr>
+              <w:t>Norm limit 1.0</w:t>
+            </w:r>
+          </w:p>
+        </w:tc>
+        <w:tc>
+          <w:tcPr>
+            <w:tcW w:type="dxa" w:w="4565"/>
+            <w:vAlign w:val="center"/>
+            <w:tcBorders>
+              <w:top w:val="single" w:sz="4" w:color="D9D9D9"/>
+              <w:left w:val="single" w:sz="4" w:color="D9D9D9"/>
+              <w:bottom w:val="single" w:sz="4" w:color="D9D9D9"/>
+              <w:right w:val="single" w:sz="4" w:color="D9D9D9"/>
+            </w:tcBorders>
+            <w:tcMar>
+              <w:top w:w="70" w:type="dxa"/>
+              <w:left w:w="70" w:type="dxa"/>
+              <w:bottom w:w="70" w:type="dxa"/>
+              <w:right w:w="70" w:type="dxa"/>
+            </w:tcMar>
+          </w:tcPr>
+          <w:p>
+            <w:pPr>
+              <w:spacing w:after="0" w:line="240" w:lineRule="auto"/>
+            </w:pPr>
+            <w:r>
+              <w:rPr>
+                <w:rFonts w:ascii="Calibri" w:hAnsi="Calibri"/>
+                <w:b w:val="0"/>
+                <w:sz w:val="20"/>
+              </w:rPr>
+              <w:t>Limits excessively large updates; it does not solve vanishing gradients.</w:t>
+            </w:r>
+          </w:p>
+        </w:tc>
+      </w:tr>
+      <w:tr>
+        <w:trPr>
+          <w:cantSplit/>
+        </w:trPr>
+        <w:tc>
+          <w:tcPr>
+            <w:tcW w:type="dxa" w:w="1656"/>
+            <w:vAlign w:val="center"/>
+            <w:tcBorders>
+              <w:top w:val="single" w:sz="4" w:color="D9D9D9"/>
+              <w:left w:val="single" w:sz="4" w:color="D9D9D9"/>
+              <w:bottom w:val="single" w:sz="4" w:color="D9D9D9"/>
+              <w:right w:val="single" w:sz="4" w:color="D9D9D9"/>
+            </w:tcBorders>
+            <w:tcMar>
+              <w:top w:w="70" w:type="dxa"/>
+              <w:left w:w="70" w:type="dxa"/>
+              <w:bottom w:w="70" w:type="dxa"/>
+              <w:right w:w="70" w:type="dxa"/>
+            </w:tcMar>
+          </w:tcPr>
+          <w:p>
+            <w:pPr>
+              <w:spacing w:after="0" w:line="240" w:lineRule="auto"/>
+            </w:pPr>
+            <w:r>
+              <w:rPr>
+                <w:rFonts w:ascii="Calibri" w:hAnsi="Calibri"/>
+                <w:b w:val="0"/>
+                <w:sz w:val="20"/>
+              </w:rPr>
+              <w:t>Output and loss</w:t>
+            </w:r>
+          </w:p>
+        </w:tc>
+        <w:tc>
+          <w:tcPr>
+            <w:tcW w:type="dxa" w:w="2664"/>
+            <w:vAlign w:val="center"/>
+            <w:tcBorders>
+              <w:top w:val="single" w:sz="4" w:color="D9D9D9"/>
+              <w:left w:val="single" w:sz="4" w:color="D9D9D9"/>
+              <w:bottom w:val="single" w:sz="4" w:color="D9D9D9"/>
+              <w:right w:val="single" w:sz="4" w:color="D9D9D9"/>
+            </w:tcBorders>
+            <w:tcMar>
+              <w:top w:w="70" w:type="dxa"/>
+              <w:left w:w="70" w:type="dxa"/>
+              <w:bottom w:w="70" w:type="dxa"/>
+              <w:right w:w="70" w:type="dxa"/>
+            </w:tcMar>
+          </w:tcPr>
+          <w:p>
+            <w:pPr>
+              <w:spacing w:after="0" w:line="240" w:lineRule="auto"/>
+            </w:pPr>
+            <w:r>
+              <w:rPr>
+                <w:rFonts w:ascii="Calibri" w:hAnsi="Calibri"/>
+                <w:b w:val="0"/>
+                <w:sz w:val="20"/>
+              </w:rPr>
+              <w:t>1 sigmoid; binary cross-entropy</w:t>
+            </w:r>
+          </w:p>
+        </w:tc>
+        <w:tc>
+          <w:tcPr>
+            <w:tcW w:type="dxa" w:w="4565"/>
+            <w:vAlign w:val="center"/>
+            <w:tcBorders>
+              <w:top w:val="single" w:sz="4" w:color="D9D9D9"/>
+              <w:left w:val="single" w:sz="4" w:color="D9D9D9"/>
+              <w:bottom w:val="single" w:sz="4" w:color="D9D9D9"/>
+              <w:right w:val="single" w:sz="4" w:color="D9D9D9"/>
+            </w:tcBorders>
+            <w:tcMar>
+              <w:top w:w="70" w:type="dxa"/>
+              <w:left w:w="70" w:type="dxa"/>
+              <w:bottom w:w="70" w:type="dxa"/>
+              <w:right w:w="70" w:type="dxa"/>
+            </w:tcMar>
+          </w:tcPr>
+          <w:p>
+            <w:pPr>
+              <w:spacing w:after="0" w:line="240" w:lineRule="auto"/>
+            </w:pPr>
+            <w:r>
+              <w:rPr>
+                <w:rFonts w:ascii="Calibri" w:hAnsi="Calibri"/>
+                <w:b w:val="0"/>
+                <w:sz w:val="20"/>
+              </w:rPr>
+              <w:t>Predicts positive sentiment probability; threshold 0.5 gives the class.</w:t>
+            </w:r>
+          </w:p>
+        </w:tc>
+      </w:tr>
+    </w:tbl>
+    <w:p>
+      <w:pPr>
+        <w:spacing w:after="140" w:line="254" w:lineRule="auto"/>
+      </w:pPr>
+      <w:r>
+        <w:rPr>
+          <w:rFonts w:ascii="Calibri" w:hAnsi="Calibri"/>
+          <w:b w:val="0"/>
+          <w:sz w:val="22"/>
+        </w:rPr>
+        <w:t>These are practical starting values, not proven optimal settings. No dropout or extra regularization was added. Parameter counts differ between models, so this compares architectures at fixed width and training settings, not at equal capacity or equal computation.</w:t>
+      </w:r>
+    </w:p>
+    <w:p>
+      <w:r>
+        <w:br w:type="page"/>
+      </w:r>
+    </w:p>
+    <w:p>
+      <w:pPr>
+        <w:pStyle w:val="Heading2"/>
+        <w:keepNext/>
+        <w:spacing w:after="180"/>
+      </w:pPr>
+      <w:r>
+        <w:t>Why the three layer GRU was selected</w:t>
+      </w:r>
+    </w:p>
+    <w:p>
+      <w:pPr>
+        <w:keepNext/>
+        <w:spacing w:after="140" w:line="254" w:lineRule="auto"/>
+      </w:pPr>
+      <w:r>
+        <w:rPr>
+          <w:rFonts w:ascii="Calibri" w:hAnsi="Calibri"/>
+          <w:b/>
+          <w:sz w:val="22"/>
+        </w:rPr>
+        <w:t>Results for every model and depth</w:t>
+      </w:r>
+    </w:p>
+    <w:tbl>
+      <w:tblPr>
+        <w:tblW w:type="auto" w:w="0"/>
+        <w:tblLayout w:type="fixed"/>
+        <w:tblLook w:firstColumn="1" w:firstRow="1" w:lastColumn="0" w:lastRow="0" w:noHBand="0" w:noVBand="1" w:val="04A0"/>
+      </w:tblPr>
+      <w:tblGrid>
+        <w:gridCol w:w="1440"/>
+        <w:gridCol w:w="864"/>
+        <w:gridCol w:w="1584"/>
+        <w:gridCol w:w="1944"/>
+        <w:gridCol w:w="864"/>
+        <w:gridCol w:w="1584"/>
+      </w:tblGrid>
+      <w:tr>
+        <w:trPr>
+          <w:cantSplit/>
+          <w:tblHeader/>
+        </w:trPr>
+        <w:tc>
+          <w:tcPr>
+            <w:tcW w:type="dxa" w:w="1440"/>
+            <w:vAlign w:val="center"/>
+            <w:tcBorders>
+              <w:top w:val="single" w:sz="4" w:color="D9D9D9"/>
+              <w:left w:val="single" w:sz="4" w:color="D9D9D9"/>
+              <w:bottom w:val="single" w:sz="4" w:color="D9D9D9"/>
+              <w:right w:val="single" w:sz="4" w:color="D9D9D9"/>
+            </w:tcBorders>
+            <w:tcMar>
+              <w:top w:w="70" w:type="dxa"/>
+              <w:left w:w="70" w:type="dxa"/>
+              <w:bottom w:w="70" w:type="dxa"/>
+              <w:right w:w="70" w:type="dxa"/>
+            </w:tcMar>
+            <w:shd w:fill="E7EDF3"/>
+          </w:tcPr>
+          <w:p>
+            <w:pPr>
+              <w:spacing w:after="0" w:line="240" w:lineRule="auto"/>
+            </w:pPr>
+            <w:r>
+              <w:rPr>
+                <w:rFonts w:ascii="Calibri" w:hAnsi="Calibri"/>
+                <w:b/>
+                <w:sz w:val="20"/>
+              </w:rPr>
+              <w:t>Model</w:t>
+            </w:r>
+          </w:p>
+        </w:tc>
+        <w:tc>
+          <w:tcPr>
+            <w:tcW w:type="dxa" w:w="864"/>
+            <w:vAlign w:val="center"/>
+            <w:tcBorders>
+              <w:top w:val="single" w:sz="4" w:color="D9D9D9"/>
+              <w:left w:val="single" w:sz="4" w:color="D9D9D9"/>
+              <w:bottom w:val="single" w:sz="4" w:color="D9D9D9"/>
+              <w:right w:val="single" w:sz="4" w:color="D9D9D9"/>
+            </w:tcBorders>
+            <w:tcMar>
+              <w:top w:w="70" w:type="dxa"/>
+              <w:left w:w="70" w:type="dxa"/>
+              <w:bottom w:w="70" w:type="dxa"/>
+              <w:right w:w="70" w:type="dxa"/>
+            </w:tcMar>
+            <w:shd w:fill="E7EDF3"/>
+          </w:tcPr>
+          <w:p>
+            <w:pPr>
+              <w:spacing w:after="0" w:line="240" w:lineRule="auto"/>
+            </w:pPr>
+            <w:r>
+              <w:rPr>
+                <w:rFonts w:ascii="Calibri" w:hAnsi="Calibri"/>
+                <w:b/>
+                <w:sz w:val="20"/>
+              </w:rPr>
+              <w:t>Layers</w:t>
+            </w:r>
+          </w:p>
+        </w:tc>
+        <w:tc>
+          <w:tcPr>
+            <w:tcW w:type="dxa" w:w="1584"/>
+            <w:vAlign w:val="center"/>
+            <w:tcBorders>
+              <w:top w:val="single" w:sz="4" w:color="D9D9D9"/>
+              <w:left w:val="single" w:sz="4" w:color="D9D9D9"/>
+              <w:bottom w:val="single" w:sz="4" w:color="D9D9D9"/>
+              <w:right w:val="single" w:sz="4" w:color="D9D9D9"/>
+            </w:tcBorders>
+            <w:tcMar>
+              <w:top w:w="70" w:type="dxa"/>
+              <w:left w:w="70" w:type="dxa"/>
+              <w:bottom w:w="70" w:type="dxa"/>
+              <w:right w:w="70" w:type="dxa"/>
+            </w:tcMar>
+            <w:shd w:fill="E7EDF3"/>
+          </w:tcPr>
+          <w:p>
+            <w:pPr>
+              <w:spacing w:after="0" w:line="240" w:lineRule="auto"/>
+            </w:pPr>
+            <w:r>
+              <w:rPr>
+                <w:rFonts w:ascii="Calibri" w:hAnsi="Calibri"/>
+                <w:b/>
+                <w:sz w:val="20"/>
+              </w:rPr>
+              <w:t>Parameters</w:t>
+            </w:r>
+          </w:p>
+        </w:tc>
+        <w:tc>
+          <w:tcPr>
+            <w:tcW w:type="dxa" w:w="1944"/>
+            <w:vAlign w:val="center"/>
+            <w:tcBorders>
+              <w:top w:val="single" w:sz="4" w:color="D9D9D9"/>
+              <w:left w:val="single" w:sz="4" w:color="D9D9D9"/>
+              <w:bottom w:val="single" w:sz="4" w:color="D9D9D9"/>
+              <w:right w:val="single" w:sz="4" w:color="D9D9D9"/>
+            </w:tcBorders>
+            <w:tcMar>
+              <w:top w:w="70" w:type="dxa"/>
+              <w:left w:w="70" w:type="dxa"/>
+              <w:bottom w:w="70" w:type="dxa"/>
+              <w:right w:w="70" w:type="dxa"/>
+            </w:tcMar>
+            <w:shd w:fill="E7EDF3"/>
+          </w:tcPr>
+          <w:p>
+            <w:pPr>
+              <w:spacing w:after="0" w:line="240" w:lineRule="auto"/>
+            </w:pPr>
+            <w:r>
+              <w:rPr>
+                <w:rFonts w:ascii="Calibri" w:hAnsi="Calibri"/>
+                <w:b/>
+                <w:sz w:val="20"/>
+              </w:rPr>
+              <w:t>Best accuracy</w:t>
+            </w:r>
+          </w:p>
+        </w:tc>
+        <w:tc>
+          <w:tcPr>
+            <w:tcW w:type="dxa" w:w="864"/>
+            <w:vAlign w:val="center"/>
+            <w:tcBorders>
+              <w:top w:val="single" w:sz="4" w:color="D9D9D9"/>
+              <w:left w:val="single" w:sz="4" w:color="D9D9D9"/>
+              <w:bottom w:val="single" w:sz="4" w:color="D9D9D9"/>
+              <w:right w:val="single" w:sz="4" w:color="D9D9D9"/>
+            </w:tcBorders>
+            <w:tcMar>
+              <w:top w:w="70" w:type="dxa"/>
+              <w:left w:w="70" w:type="dxa"/>
+              <w:bottom w:w="70" w:type="dxa"/>
+              <w:right w:w="70" w:type="dxa"/>
+            </w:tcMar>
+            <w:shd w:fill="E7EDF3"/>
+          </w:tcPr>
+          <w:p>
+            <w:pPr>
+              <w:spacing w:after="0" w:line="240" w:lineRule="auto"/>
+            </w:pPr>
+            <w:r>
+              <w:rPr>
+                <w:rFonts w:ascii="Calibri" w:hAnsi="Calibri"/>
+                <w:b/>
+                <w:sz w:val="20"/>
+              </w:rPr>
+              <w:t>Epoch</w:t>
+            </w:r>
+          </w:p>
+        </w:tc>
+        <w:tc>
+          <w:tcPr>
+            <w:tcW w:type="dxa" w:w="1584"/>
+            <w:vAlign w:val="center"/>
+            <w:tcBorders>
+              <w:top w:val="single" w:sz="4" w:color="D9D9D9"/>
+              <w:left w:val="single" w:sz="4" w:color="D9D9D9"/>
+              <w:bottom w:val="single" w:sz="4" w:color="D9D9D9"/>
+              <w:right w:val="single" w:sz="4" w:color="D9D9D9"/>
+            </w:tcBorders>
+            <w:tcMar>
+              <w:top w:w="70" w:type="dxa"/>
+              <w:left w:w="70" w:type="dxa"/>
+              <w:bottom w:w="70" w:type="dxa"/>
+              <w:right w:w="70" w:type="dxa"/>
+            </w:tcMar>
+            <w:shd w:fill="E7EDF3"/>
+          </w:tcPr>
+          <w:p>
+            <w:pPr>
+              <w:spacing w:after="0" w:line="240" w:lineRule="auto"/>
+            </w:pPr>
+            <w:r>
+              <w:rPr>
+                <w:rFonts w:ascii="Calibri" w:hAnsi="Calibri"/>
+                <w:b/>
+                <w:sz w:val="20"/>
+              </w:rPr>
+              <w:t>Related loss</w:t>
+            </w:r>
+          </w:p>
+        </w:tc>
+      </w:tr>
+      <w:tr>
+        <w:trPr>
+          <w:cantSplit/>
+        </w:trPr>
+        <w:tc>
+          <w:tcPr>
+            <w:tcW w:type="dxa" w:w="1440"/>
+            <w:vAlign w:val="center"/>
+            <w:tcBorders>
+              <w:top w:val="single" w:sz="4" w:color="D9D9D9"/>
+              <w:left w:val="single" w:sz="4" w:color="D9D9D9"/>
+              <w:bottom w:val="single" w:sz="4" w:color="D9D9D9"/>
+              <w:right w:val="single" w:sz="4" w:color="D9D9D9"/>
+            </w:tcBorders>
+            <w:tcMar>
+              <w:top w:w="70" w:type="dxa"/>
+              <w:left w:w="70" w:type="dxa"/>
+              <w:bottom w:w="70" w:type="dxa"/>
+              <w:right w:w="70" w:type="dxa"/>
+            </w:tcMar>
+          </w:tcPr>
+          <w:p>
+            <w:pPr>
+              <w:spacing w:after="0" w:line="240" w:lineRule="auto"/>
+            </w:pPr>
+            <w:r>
+              <w:rPr>
+                <w:rFonts w:ascii="Calibri" w:hAnsi="Calibri"/>
+                <w:b w:val="0"/>
+                <w:sz w:val="20"/>
+              </w:rPr>
+              <w:t>SimpleRNN</w:t>
+            </w:r>
+          </w:p>
+        </w:tc>
+        <w:tc>
+          <w:tcPr>
+            <w:tcW w:type="dxa" w:w="864"/>
+            <w:vAlign w:val="center"/>
+            <w:tcBorders>
+              <w:top w:val="single" w:sz="4" w:color="D9D9D9"/>
+              <w:left w:val="single" w:sz="4" w:color="D9D9D9"/>
+              <w:bottom w:val="single" w:sz="4" w:color="D9D9D9"/>
+              <w:right w:val="single" w:sz="4" w:color="D9D9D9"/>
+            </w:tcBorders>
+            <w:tcMar>
+              <w:top w:w="70" w:type="dxa"/>
+              <w:left w:w="70" w:type="dxa"/>
+              <w:bottom w:w="70" w:type="dxa"/>
+              <w:right w:w="70" w:type="dxa"/>
+            </w:tcMar>
+          </w:tcPr>
+          <w:p>
+            <w:pPr>
+              <w:spacing w:after="0" w:line="240" w:lineRule="auto"/>
+            </w:pPr>
+            <w:r>
+              <w:rPr>
+                <w:rFonts w:ascii="Calibri" w:hAnsi="Calibri"/>
+                <w:b w:val="0"/>
+                <w:sz w:val="20"/>
+              </w:rPr>
+              <w:t>1</w:t>
+            </w:r>
+          </w:p>
+        </w:tc>
+        <w:tc>
+          <w:tcPr>
+            <w:tcW w:type="dxa" w:w="1584"/>
+            <w:vAlign w:val="center"/>
+            <w:tcBorders>
+              <w:top w:val="single" w:sz="4" w:color="D9D9D9"/>
+              <w:left w:val="single" w:sz="4" w:color="D9D9D9"/>
+              <w:bottom w:val="single" w:sz="4" w:color="D9D9D9"/>
+              <w:right w:val="single" w:sz="4" w:color="D9D9D9"/>
+            </w:tcBorders>
+            <w:tcMar>
+              <w:top w:w="70" w:type="dxa"/>
+              <w:left w:w="70" w:type="dxa"/>
+              <w:bottom w:w="70" w:type="dxa"/>
+              <w:right w:w="70" w:type="dxa"/>
+            </w:tcMar>
+          </w:tcPr>
+          <w:p>
+            <w:pPr>
+              <w:spacing w:after="0" w:line="240" w:lineRule="auto"/>
+            </w:pPr>
+            <w:r>
+              <w:rPr>
+                <w:rFonts w:ascii="Calibri" w:hAnsi="Calibri"/>
+                <w:b w:val="0"/>
+                <w:sz w:val="20"/>
+              </w:rPr>
+              <w:t>322,113</w:t>
+            </w:r>
+          </w:p>
+        </w:tc>
+        <w:tc>
+          <w:tcPr>
+            <w:tcW w:type="dxa" w:w="1944"/>
+            <w:vAlign w:val="center"/>
+            <w:tcBorders>
+              <w:top w:val="single" w:sz="4" w:color="D9D9D9"/>
+              <w:left w:val="single" w:sz="4" w:color="D9D9D9"/>
+              <w:bottom w:val="single" w:sz="4" w:color="D9D9D9"/>
+              <w:right w:val="single" w:sz="4" w:color="D9D9D9"/>
+            </w:tcBorders>
+            <w:tcMar>
+              <w:top w:w="70" w:type="dxa"/>
+              <w:left w:w="70" w:type="dxa"/>
+              <w:bottom w:w="70" w:type="dxa"/>
+              <w:right w:w="70" w:type="dxa"/>
+            </w:tcMar>
+          </w:tcPr>
+          <w:p>
+            <w:pPr>
+              <w:spacing w:after="0" w:line="240" w:lineRule="auto"/>
+            </w:pPr>
+            <w:r>
+              <w:rPr>
+                <w:rFonts w:ascii="Calibri" w:hAnsi="Calibri"/>
+                <w:b w:val="0"/>
+                <w:sz w:val="20"/>
+              </w:rPr>
+              <w:t>87.72%</w:t>
+            </w:r>
+          </w:p>
+        </w:tc>
+        <w:tc>
+          <w:tcPr>
+            <w:tcW w:type="dxa" w:w="864"/>
+            <w:vAlign w:val="center"/>
+            <w:tcBorders>
+              <w:top w:val="single" w:sz="4" w:color="D9D9D9"/>
+              <w:left w:val="single" w:sz="4" w:color="D9D9D9"/>
+              <w:bottom w:val="single" w:sz="4" w:color="D9D9D9"/>
+              <w:right w:val="single" w:sz="4" w:color="D9D9D9"/>
+            </w:tcBorders>
+            <w:tcMar>
+              <w:top w:w="70" w:type="dxa"/>
+              <w:left w:w="70" w:type="dxa"/>
+              <w:bottom w:w="70" w:type="dxa"/>
+              <w:right w:w="70" w:type="dxa"/>
+            </w:tcMar>
+          </w:tcPr>
+          <w:p>
+            <w:pPr>
+              <w:spacing w:after="0" w:line="240" w:lineRule="auto"/>
+            </w:pPr>
+            <w:r>
+              <w:rPr>
+                <w:rFonts w:ascii="Calibri" w:hAnsi="Calibri"/>
+                <w:b w:val="0"/>
+                <w:sz w:val="20"/>
+              </w:rPr>
+              <w:t>4</w:t>
+            </w:r>
+          </w:p>
+        </w:tc>
+        <w:tc>
+          <w:tcPr>
+            <w:tcW w:type="dxa" w:w="1584"/>
+            <w:vAlign w:val="center"/>
+            <w:tcBorders>
+              <w:top w:val="single" w:sz="4" w:color="D9D9D9"/>
+              <w:left w:val="single" w:sz="4" w:color="D9D9D9"/>
+              <w:bottom w:val="single" w:sz="4" w:color="D9D9D9"/>
+              <w:right w:val="single" w:sz="4" w:color="D9D9D9"/>
+            </w:tcBorders>
+            <w:tcMar>
+              <w:top w:w="70" w:type="dxa"/>
+              <w:left w:w="70" w:type="dxa"/>
+              <w:bottom w:w="70" w:type="dxa"/>
+              <w:right w:w="70" w:type="dxa"/>
+            </w:tcMar>
+          </w:tcPr>
+          <w:p>
+            <w:pPr>
+              <w:spacing w:after="0" w:line="240" w:lineRule="auto"/>
+            </w:pPr>
+            <w:r>
+              <w:rPr>
+                <w:rFonts w:ascii="Calibri" w:hAnsi="Calibri"/>
+                <w:b w:val="0"/>
+                <w:sz w:val="20"/>
+              </w:rPr>
+              <w:t>0.3522</w:t>
+            </w:r>
+          </w:p>
+        </w:tc>
+      </w:tr>
+      <w:tr>
+        <w:trPr>
+          <w:cantSplit/>
+        </w:trPr>
+        <w:tc>
+          <w:tcPr>
+            <w:tcW w:type="dxa" w:w="1440"/>
+            <w:vAlign w:val="center"/>
+            <w:tcBorders>
+              <w:top w:val="single" w:sz="4" w:color="D9D9D9"/>
+              <w:left w:val="single" w:sz="4" w:color="D9D9D9"/>
+              <w:bottom w:val="single" w:sz="4" w:color="D9D9D9"/>
+              <w:right w:val="single" w:sz="4" w:color="D9D9D9"/>
+            </w:tcBorders>
+            <w:tcMar>
+              <w:top w:w="70" w:type="dxa"/>
+              <w:left w:w="70" w:type="dxa"/>
+              <w:bottom w:w="70" w:type="dxa"/>
+              <w:right w:w="70" w:type="dxa"/>
+            </w:tcMar>
+          </w:tcPr>
+          <w:p>
+            <w:pPr>
+              <w:spacing w:after="0" w:line="240" w:lineRule="auto"/>
+            </w:pPr>
+            <w:r>
+              <w:rPr>
+                <w:rFonts w:ascii="Calibri" w:hAnsi="Calibri"/>
+                <w:b w:val="0"/>
+                <w:sz w:val="20"/>
+              </w:rPr>
+              <w:t>SimpleRNN</w:t>
+            </w:r>
+          </w:p>
+        </w:tc>
+        <w:tc>
+          <w:tcPr>
+            <w:tcW w:type="dxa" w:w="864"/>
+            <w:vAlign w:val="center"/>
+            <w:tcBorders>
+              <w:top w:val="single" w:sz="4" w:color="D9D9D9"/>
+              <w:left w:val="single" w:sz="4" w:color="D9D9D9"/>
+              <w:bottom w:val="single" w:sz="4" w:color="D9D9D9"/>
+              <w:right w:val="single" w:sz="4" w:color="D9D9D9"/>
+            </w:tcBorders>
+            <w:tcMar>
+              <w:top w:w="70" w:type="dxa"/>
+              <w:left w:w="70" w:type="dxa"/>
+              <w:bottom w:w="70" w:type="dxa"/>
+              <w:right w:w="70" w:type="dxa"/>
+            </w:tcMar>
+          </w:tcPr>
+          <w:p>
+            <w:pPr>
+              <w:spacing w:after="0" w:line="240" w:lineRule="auto"/>
+            </w:pPr>
+            <w:r>
+              <w:rPr>
+                <w:rFonts w:ascii="Calibri" w:hAnsi="Calibri"/>
+                <w:b w:val="0"/>
+                <w:sz w:val="20"/>
+              </w:rPr>
+              <w:t>2</w:t>
+            </w:r>
+          </w:p>
+        </w:tc>
+        <w:tc>
+          <w:tcPr>
+            <w:tcW w:type="dxa" w:w="1584"/>
+            <w:vAlign w:val="center"/>
+            <w:tcBorders>
+              <w:top w:val="single" w:sz="4" w:color="D9D9D9"/>
+              <w:left w:val="single" w:sz="4" w:color="D9D9D9"/>
+              <w:bottom w:val="single" w:sz="4" w:color="D9D9D9"/>
+              <w:right w:val="single" w:sz="4" w:color="D9D9D9"/>
+            </w:tcBorders>
+            <w:tcMar>
+              <w:top w:w="70" w:type="dxa"/>
+              <w:left w:w="70" w:type="dxa"/>
+              <w:bottom w:w="70" w:type="dxa"/>
+              <w:right w:w="70" w:type="dxa"/>
+            </w:tcMar>
+          </w:tcPr>
+          <w:p>
+            <w:pPr>
+              <w:spacing w:after="0" w:line="240" w:lineRule="auto"/>
+            </w:pPr>
+            <w:r>
+              <w:rPr>
+                <w:rFonts w:ascii="Calibri" w:hAnsi="Calibri"/>
+                <w:b w:val="0"/>
+                <w:sz w:val="20"/>
+              </w:rPr>
+              <w:t>324,193</w:t>
+            </w:r>
+          </w:p>
+        </w:tc>
+        <w:tc>
+          <w:tcPr>
+            <w:tcW w:type="dxa" w:w="1944"/>
+            <w:vAlign w:val="center"/>
+            <w:tcBorders>
+              <w:top w:val="single" w:sz="4" w:color="D9D9D9"/>
+              <w:left w:val="single" w:sz="4" w:color="D9D9D9"/>
+              <w:bottom w:val="single" w:sz="4" w:color="D9D9D9"/>
+              <w:right w:val="single" w:sz="4" w:color="D9D9D9"/>
+            </w:tcBorders>
+            <w:tcMar>
+              <w:top w:w="70" w:type="dxa"/>
+              <w:left w:w="70" w:type="dxa"/>
+              <w:bottom w:w="70" w:type="dxa"/>
+              <w:right w:w="70" w:type="dxa"/>
+            </w:tcMar>
+          </w:tcPr>
+          <w:p>
+            <w:pPr>
+              <w:spacing w:after="0" w:line="240" w:lineRule="auto"/>
+            </w:pPr>
+            <w:r>
+              <w:rPr>
+                <w:rFonts w:ascii="Calibri" w:hAnsi="Calibri"/>
+                <w:b w:val="0"/>
+                <w:sz w:val="20"/>
+              </w:rPr>
+              <w:t>84.96%</w:t>
+            </w:r>
+          </w:p>
+        </w:tc>
+        <w:tc>
+          <w:tcPr>
+            <w:tcW w:type="dxa" w:w="864"/>
+            <w:vAlign w:val="center"/>
+            <w:tcBorders>
+              <w:top w:val="single" w:sz="4" w:color="D9D9D9"/>
+              <w:left w:val="single" w:sz="4" w:color="D9D9D9"/>
+              <w:bottom w:val="single" w:sz="4" w:color="D9D9D9"/>
+              <w:right w:val="single" w:sz="4" w:color="D9D9D9"/>
+            </w:tcBorders>
+            <w:tcMar>
+              <w:top w:w="70" w:type="dxa"/>
+              <w:left w:w="70" w:type="dxa"/>
+              <w:bottom w:w="70" w:type="dxa"/>
+              <w:right w:w="70" w:type="dxa"/>
+            </w:tcMar>
+          </w:tcPr>
+          <w:p>
+            <w:pPr>
+              <w:spacing w:after="0" w:line="240" w:lineRule="auto"/>
+            </w:pPr>
+            <w:r>
+              <w:rPr>
+                <w:rFonts w:ascii="Calibri" w:hAnsi="Calibri"/>
+                <w:b w:val="0"/>
+                <w:sz w:val="20"/>
+              </w:rPr>
+              <w:t>1</w:t>
+            </w:r>
+          </w:p>
+        </w:tc>
+        <w:tc>
+          <w:tcPr>
+            <w:tcW w:type="dxa" w:w="1584"/>
+            <w:vAlign w:val="center"/>
+            <w:tcBorders>
+              <w:top w:val="single" w:sz="4" w:color="D9D9D9"/>
+              <w:left w:val="single" w:sz="4" w:color="D9D9D9"/>
+              <w:bottom w:val="single" w:sz="4" w:color="D9D9D9"/>
+              <w:right w:val="single" w:sz="4" w:color="D9D9D9"/>
+            </w:tcBorders>
+            <w:tcMar>
+              <w:top w:w="70" w:type="dxa"/>
+              <w:left w:w="70" w:type="dxa"/>
+              <w:bottom w:w="70" w:type="dxa"/>
+              <w:right w:w="70" w:type="dxa"/>
+            </w:tcMar>
+          </w:tcPr>
+          <w:p>
+            <w:pPr>
+              <w:spacing w:after="0" w:line="240" w:lineRule="auto"/>
+            </w:pPr>
+            <w:r>
+              <w:rPr>
+                <w:rFonts w:ascii="Calibri" w:hAnsi="Calibri"/>
+                <w:b w:val="0"/>
+                <w:sz w:val="20"/>
+              </w:rPr>
+              <w:t>0.3752</w:t>
+            </w:r>
+          </w:p>
+        </w:tc>
+      </w:tr>
+      <w:tr>
+        <w:trPr>
+          <w:cantSplit/>
+        </w:trPr>
+        <w:tc>
+          <w:tcPr>
+            <w:tcW w:type="dxa" w:w="1440"/>
+            <w:vAlign w:val="center"/>
+            <w:tcBorders>
+              <w:top w:val="single" w:sz="4" w:color="D9D9D9"/>
+              <w:left w:val="single" w:sz="4" w:color="D9D9D9"/>
+              <w:bottom w:val="single" w:sz="4" w:color="D9D9D9"/>
+              <w:right w:val="single" w:sz="4" w:color="D9D9D9"/>
+            </w:tcBorders>
+            <w:tcMar>
+              <w:top w:w="70" w:type="dxa"/>
+              <w:left w:w="70" w:type="dxa"/>
+              <w:bottom w:w="70" w:type="dxa"/>
+              <w:right w:w="70" w:type="dxa"/>
+            </w:tcMar>
+          </w:tcPr>
+          <w:p>
+            <w:pPr>
+              <w:spacing w:after="0" w:line="240" w:lineRule="auto"/>
+            </w:pPr>
+            <w:r>
+              <w:rPr>
+                <w:rFonts w:ascii="Calibri" w:hAnsi="Calibri"/>
+                <w:b w:val="0"/>
+                <w:sz w:val="20"/>
+              </w:rPr>
+              <w:t>SimpleRNN</w:t>
+            </w:r>
+          </w:p>
+        </w:tc>
+        <w:tc>
+          <w:tcPr>
+            <w:tcW w:type="dxa" w:w="864"/>
+            <w:vAlign w:val="center"/>
+            <w:tcBorders>
+              <w:top w:val="single" w:sz="4" w:color="D9D9D9"/>
+              <w:left w:val="single" w:sz="4" w:color="D9D9D9"/>
+              <w:bottom w:val="single" w:sz="4" w:color="D9D9D9"/>
+              <w:right w:val="single" w:sz="4" w:color="D9D9D9"/>
+            </w:tcBorders>
+            <w:tcMar>
+              <w:top w:w="70" w:type="dxa"/>
+              <w:left w:w="70" w:type="dxa"/>
+              <w:bottom w:w="70" w:type="dxa"/>
+              <w:right w:w="70" w:type="dxa"/>
+            </w:tcMar>
+          </w:tcPr>
+          <w:p>
+            <w:pPr>
+              <w:spacing w:after="0" w:line="240" w:lineRule="auto"/>
+            </w:pPr>
+            <w:r>
+              <w:rPr>
+                <w:rFonts w:ascii="Calibri" w:hAnsi="Calibri"/>
+                <w:b w:val="0"/>
+                <w:sz w:val="20"/>
+              </w:rPr>
+              <w:t>3</w:t>
+            </w:r>
+          </w:p>
+        </w:tc>
+        <w:tc>
+          <w:tcPr>
+            <w:tcW w:type="dxa" w:w="1584"/>
+            <w:vAlign w:val="center"/>
+            <w:tcBorders>
+              <w:top w:val="single" w:sz="4" w:color="D9D9D9"/>
+              <w:left w:val="single" w:sz="4" w:color="D9D9D9"/>
+              <w:bottom w:val="single" w:sz="4" w:color="D9D9D9"/>
+              <w:right w:val="single" w:sz="4" w:color="D9D9D9"/>
+            </w:tcBorders>
+            <w:tcMar>
+              <w:top w:w="70" w:type="dxa"/>
+              <w:left w:w="70" w:type="dxa"/>
+              <w:bottom w:w="70" w:type="dxa"/>
+              <w:right w:w="70" w:type="dxa"/>
+            </w:tcMar>
+          </w:tcPr>
+          <w:p>
+            <w:pPr>
+              <w:spacing w:after="0" w:line="240" w:lineRule="auto"/>
+            </w:pPr>
+            <w:r>
+              <w:rPr>
+                <w:rFonts w:ascii="Calibri" w:hAnsi="Calibri"/>
+                <w:b w:val="0"/>
+                <w:sz w:val="20"/>
+              </w:rPr>
+              <w:t>326,273</w:t>
+            </w:r>
+          </w:p>
+        </w:tc>
+        <w:tc>
+          <w:tcPr>
+            <w:tcW w:type="dxa" w:w="1944"/>
+            <w:vAlign w:val="center"/>
+            <w:tcBorders>
+              <w:top w:val="single" w:sz="4" w:color="D9D9D9"/>
+              <w:left w:val="single" w:sz="4" w:color="D9D9D9"/>
+              <w:bottom w:val="single" w:sz="4" w:color="D9D9D9"/>
+              <w:right w:val="single" w:sz="4" w:color="D9D9D9"/>
+            </w:tcBorders>
+            <w:tcMar>
+              <w:top w:w="70" w:type="dxa"/>
+              <w:left w:w="70" w:type="dxa"/>
+              <w:bottom w:w="70" w:type="dxa"/>
+              <w:right w:w="70" w:type="dxa"/>
+            </w:tcMar>
+          </w:tcPr>
+          <w:p>
+            <w:pPr>
+              <w:spacing w:after="0" w:line="240" w:lineRule="auto"/>
+            </w:pPr>
+            <w:r>
+              <w:rPr>
+                <w:rFonts w:ascii="Calibri" w:hAnsi="Calibri"/>
+                <w:b w:val="0"/>
+                <w:sz w:val="20"/>
+              </w:rPr>
+              <w:t>85.58%</w:t>
+            </w:r>
+          </w:p>
+        </w:tc>
+        <w:tc>
+          <w:tcPr>
+            <w:tcW w:type="dxa" w:w="864"/>
+            <w:vAlign w:val="center"/>
+            <w:tcBorders>
+              <w:top w:val="single" w:sz="4" w:color="D9D9D9"/>
+              <w:left w:val="single" w:sz="4" w:color="D9D9D9"/>
+              <w:bottom w:val="single" w:sz="4" w:color="D9D9D9"/>
+              <w:right w:val="single" w:sz="4" w:color="D9D9D9"/>
+            </w:tcBorders>
+            <w:tcMar>
+              <w:top w:w="70" w:type="dxa"/>
+              <w:left w:w="70" w:type="dxa"/>
+              <w:bottom w:w="70" w:type="dxa"/>
+              <w:right w:w="70" w:type="dxa"/>
+            </w:tcMar>
+          </w:tcPr>
+          <w:p>
+            <w:pPr>
+              <w:spacing w:after="0" w:line="240" w:lineRule="auto"/>
+            </w:pPr>
+            <w:r>
+              <w:rPr>
+                <w:rFonts w:ascii="Calibri" w:hAnsi="Calibri"/>
+                <w:b w:val="0"/>
+                <w:sz w:val="20"/>
+              </w:rPr>
+              <w:t>1</w:t>
+            </w:r>
+          </w:p>
+        </w:tc>
+        <w:tc>
+          <w:tcPr>
+            <w:tcW w:type="dxa" w:w="1584"/>
+            <w:vAlign w:val="center"/>
+            <w:tcBorders>
+              <w:top w:val="single" w:sz="4" w:color="D9D9D9"/>
+              <w:left w:val="single" w:sz="4" w:color="D9D9D9"/>
+              <w:bottom w:val="single" w:sz="4" w:color="D9D9D9"/>
+              <w:right w:val="single" w:sz="4" w:color="D9D9D9"/>
+            </w:tcBorders>
+            <w:tcMar>
+              <w:top w:w="70" w:type="dxa"/>
+              <w:left w:w="70" w:type="dxa"/>
+              <w:bottom w:w="70" w:type="dxa"/>
+              <w:right w:w="70" w:type="dxa"/>
+            </w:tcMar>
+          </w:tcPr>
+          <w:p>
+            <w:pPr>
+              <w:spacing w:after="0" w:line="240" w:lineRule="auto"/>
+            </w:pPr>
+            <w:r>
+              <w:rPr>
+                <w:rFonts w:ascii="Calibri" w:hAnsi="Calibri"/>
+                <w:b w:val="0"/>
+                <w:sz w:val="20"/>
+              </w:rPr>
+              <w:t>0.3656</w:t>
+            </w:r>
+          </w:p>
+        </w:tc>
+      </w:tr>
+      <w:tr>
+        <w:trPr>
+          <w:cantSplit/>
+        </w:trPr>
+        <w:tc>
+          <w:tcPr>
+            <w:tcW w:type="dxa" w:w="1440"/>
+            <w:vAlign w:val="center"/>
+            <w:tcBorders>
+              <w:top w:val="single" w:sz="4" w:color="D9D9D9"/>
+              <w:left w:val="single" w:sz="4" w:color="D9D9D9"/>
+              <w:bottom w:val="single" w:sz="4" w:color="D9D9D9"/>
+              <w:right w:val="single" w:sz="4" w:color="D9D9D9"/>
+            </w:tcBorders>
+            <w:tcMar>
+              <w:top w:w="70" w:type="dxa"/>
+              <w:left w:w="70" w:type="dxa"/>
+              <w:bottom w:w="70" w:type="dxa"/>
+              <w:right w:w="70" w:type="dxa"/>
+            </w:tcMar>
+          </w:tcPr>
+          <w:p>
+            <w:pPr>
+              <w:spacing w:after="0" w:line="240" w:lineRule="auto"/>
+            </w:pPr>
+            <w:r>
+              <w:rPr>
+                <w:rFonts w:ascii="Calibri" w:hAnsi="Calibri"/>
+                <w:b w:val="0"/>
+                <w:sz w:val="20"/>
+              </w:rPr>
+              <w:t>GRU</w:t>
+            </w:r>
+          </w:p>
+        </w:tc>
+        <w:tc>
+          <w:tcPr>
+            <w:tcW w:type="dxa" w:w="864"/>
+            <w:vAlign w:val="center"/>
+            <w:tcBorders>
+              <w:top w:val="single" w:sz="4" w:color="D9D9D9"/>
+              <w:left w:val="single" w:sz="4" w:color="D9D9D9"/>
+              <w:bottom w:val="single" w:sz="4" w:color="D9D9D9"/>
+              <w:right w:val="single" w:sz="4" w:color="D9D9D9"/>
+            </w:tcBorders>
+            <w:tcMar>
+              <w:top w:w="70" w:type="dxa"/>
+              <w:left w:w="70" w:type="dxa"/>
+              <w:bottom w:w="70" w:type="dxa"/>
+              <w:right w:w="70" w:type="dxa"/>
+            </w:tcMar>
+          </w:tcPr>
+          <w:p>
+            <w:pPr>
+              <w:spacing w:after="0" w:line="240" w:lineRule="auto"/>
+            </w:pPr>
+            <w:r>
+              <w:rPr>
+                <w:rFonts w:ascii="Calibri" w:hAnsi="Calibri"/>
+                <w:b w:val="0"/>
+                <w:sz w:val="20"/>
+              </w:rPr>
+              <w:t>1</w:t>
+            </w:r>
+          </w:p>
+        </w:tc>
+        <w:tc>
+          <w:tcPr>
+            <w:tcW w:type="dxa" w:w="1584"/>
+            <w:vAlign w:val="center"/>
+            <w:tcBorders>
+              <w:top w:val="single" w:sz="4" w:color="D9D9D9"/>
+              <w:left w:val="single" w:sz="4" w:color="D9D9D9"/>
+              <w:bottom w:val="single" w:sz="4" w:color="D9D9D9"/>
+              <w:right w:val="single" w:sz="4" w:color="D9D9D9"/>
+            </w:tcBorders>
+            <w:tcMar>
+              <w:top w:w="70" w:type="dxa"/>
+              <w:left w:w="70" w:type="dxa"/>
+              <w:bottom w:w="70" w:type="dxa"/>
+              <w:right w:w="70" w:type="dxa"/>
+            </w:tcMar>
+          </w:tcPr>
+          <w:p>
+            <w:pPr>
+              <w:spacing w:after="0" w:line="240" w:lineRule="auto"/>
+            </w:pPr>
+            <w:r>
+              <w:rPr>
+                <w:rFonts w:ascii="Calibri" w:hAnsi="Calibri"/>
+                <w:b w:val="0"/>
+                <w:sz w:val="20"/>
+              </w:rPr>
+              <w:t>326,369</w:t>
+            </w:r>
+          </w:p>
+        </w:tc>
+        <w:tc>
+          <w:tcPr>
+            <w:tcW w:type="dxa" w:w="1944"/>
+            <w:vAlign w:val="center"/>
+            <w:tcBorders>
+              <w:top w:val="single" w:sz="4" w:color="D9D9D9"/>
+              <w:left w:val="single" w:sz="4" w:color="D9D9D9"/>
+              <w:bottom w:val="single" w:sz="4" w:color="D9D9D9"/>
+              <w:right w:val="single" w:sz="4" w:color="D9D9D9"/>
+            </w:tcBorders>
+            <w:tcMar>
+              <w:top w:w="70" w:type="dxa"/>
+              <w:left w:w="70" w:type="dxa"/>
+              <w:bottom w:w="70" w:type="dxa"/>
+              <w:right w:w="70" w:type="dxa"/>
+            </w:tcMar>
+          </w:tcPr>
+          <w:p>
+            <w:pPr>
+              <w:spacing w:after="0" w:line="240" w:lineRule="auto"/>
+            </w:pPr>
+            <w:r>
+              <w:rPr>
+                <w:rFonts w:ascii="Calibri" w:hAnsi="Calibri"/>
+                <w:b w:val="0"/>
+                <w:sz w:val="20"/>
+              </w:rPr>
+              <w:t>89.12%</w:t>
+            </w:r>
+          </w:p>
+        </w:tc>
+        <w:tc>
+          <w:tcPr>
+            <w:tcW w:type="dxa" w:w="864"/>
+            <w:vAlign w:val="center"/>
+            <w:tcBorders>
+              <w:top w:val="single" w:sz="4" w:color="D9D9D9"/>
+              <w:left w:val="single" w:sz="4" w:color="D9D9D9"/>
+              <w:bottom w:val="single" w:sz="4" w:color="D9D9D9"/>
+              <w:right w:val="single" w:sz="4" w:color="D9D9D9"/>
+            </w:tcBorders>
+            <w:tcMar>
+              <w:top w:w="70" w:type="dxa"/>
+              <w:left w:w="70" w:type="dxa"/>
+              <w:bottom w:w="70" w:type="dxa"/>
+              <w:right w:w="70" w:type="dxa"/>
+            </w:tcMar>
+          </w:tcPr>
+          <w:p>
+            <w:pPr>
+              <w:spacing w:after="0" w:line="240" w:lineRule="auto"/>
+            </w:pPr>
+            <w:r>
+              <w:rPr>
+                <w:rFonts w:ascii="Calibri" w:hAnsi="Calibri"/>
+                <w:b w:val="0"/>
+                <w:sz w:val="20"/>
+              </w:rPr>
+              <w:t>9</w:t>
+            </w:r>
+          </w:p>
+        </w:tc>
+        <w:tc>
+          <w:tcPr>
+            <w:tcW w:type="dxa" w:w="1584"/>
+            <w:vAlign w:val="center"/>
+            <w:tcBorders>
+              <w:top w:val="single" w:sz="4" w:color="D9D9D9"/>
+              <w:left w:val="single" w:sz="4" w:color="D9D9D9"/>
+              <w:bottom w:val="single" w:sz="4" w:color="D9D9D9"/>
+              <w:right w:val="single" w:sz="4" w:color="D9D9D9"/>
+            </w:tcBorders>
+            <w:tcMar>
+              <w:top w:w="70" w:type="dxa"/>
+              <w:left w:w="70" w:type="dxa"/>
+              <w:bottom w:w="70" w:type="dxa"/>
+              <w:right w:w="70" w:type="dxa"/>
+            </w:tcMar>
+          </w:tcPr>
+          <w:p>
+            <w:pPr>
+              <w:spacing w:after="0" w:line="240" w:lineRule="auto"/>
+            </w:pPr>
+            <w:r>
+              <w:rPr>
+                <w:rFonts w:ascii="Calibri" w:hAnsi="Calibri"/>
+                <w:b w:val="0"/>
+                <w:sz w:val="20"/>
+              </w:rPr>
+              <w:t>0.3479</w:t>
+            </w:r>
+          </w:p>
+        </w:tc>
+      </w:tr>
+      <w:tr>
+        <w:trPr>
+          <w:cantSplit/>
+        </w:trPr>
+        <w:tc>
+          <w:tcPr>
+            <w:tcW w:type="dxa" w:w="1440"/>
+            <w:vAlign w:val="center"/>
+            <w:tcBorders>
+              <w:top w:val="single" w:sz="4" w:color="D9D9D9"/>
+              <w:left w:val="single" w:sz="4" w:color="D9D9D9"/>
+              <w:bottom w:val="single" w:sz="4" w:color="D9D9D9"/>
+              <w:right w:val="single" w:sz="4" w:color="D9D9D9"/>
+            </w:tcBorders>
+            <w:tcMar>
+              <w:top w:w="70" w:type="dxa"/>
+              <w:left w:w="70" w:type="dxa"/>
+              <w:bottom w:w="70" w:type="dxa"/>
+              <w:right w:w="70" w:type="dxa"/>
+            </w:tcMar>
+          </w:tcPr>
+          <w:p>
+            <w:pPr>
+              <w:spacing w:after="0" w:line="240" w:lineRule="auto"/>
+            </w:pPr>
+            <w:r>
+              <w:rPr>
+                <w:rFonts w:ascii="Calibri" w:hAnsi="Calibri"/>
+                <w:b w:val="0"/>
+                <w:sz w:val="20"/>
+              </w:rPr>
+              <w:t>GRU</w:t>
+            </w:r>
+          </w:p>
+        </w:tc>
+        <w:tc>
+          <w:tcPr>
+            <w:tcW w:type="dxa" w:w="864"/>
+            <w:vAlign w:val="center"/>
+            <w:tcBorders>
+              <w:top w:val="single" w:sz="4" w:color="D9D9D9"/>
+              <w:left w:val="single" w:sz="4" w:color="D9D9D9"/>
+              <w:bottom w:val="single" w:sz="4" w:color="D9D9D9"/>
+              <w:right w:val="single" w:sz="4" w:color="D9D9D9"/>
+            </w:tcBorders>
+            <w:tcMar>
+              <w:top w:w="70" w:type="dxa"/>
+              <w:left w:w="70" w:type="dxa"/>
+              <w:bottom w:w="70" w:type="dxa"/>
+              <w:right w:w="70" w:type="dxa"/>
+            </w:tcMar>
+          </w:tcPr>
+          <w:p>
+            <w:pPr>
+              <w:spacing w:after="0" w:line="240" w:lineRule="auto"/>
+            </w:pPr>
+            <w:r>
+              <w:rPr>
+                <w:rFonts w:ascii="Calibri" w:hAnsi="Calibri"/>
+                <w:b w:val="0"/>
+                <w:sz w:val="20"/>
+              </w:rPr>
+              <w:t>2</w:t>
+            </w:r>
+          </w:p>
+        </w:tc>
+        <w:tc>
+          <w:tcPr>
+            <w:tcW w:type="dxa" w:w="1584"/>
+            <w:vAlign w:val="center"/>
+            <w:tcBorders>
+              <w:top w:val="single" w:sz="4" w:color="D9D9D9"/>
+              <w:left w:val="single" w:sz="4" w:color="D9D9D9"/>
+              <w:bottom w:val="single" w:sz="4" w:color="D9D9D9"/>
+              <w:right w:val="single" w:sz="4" w:color="D9D9D9"/>
+            </w:tcBorders>
+            <w:tcMar>
+              <w:top w:w="70" w:type="dxa"/>
+              <w:left w:w="70" w:type="dxa"/>
+              <w:bottom w:w="70" w:type="dxa"/>
+              <w:right w:w="70" w:type="dxa"/>
+            </w:tcMar>
+          </w:tcPr>
+          <w:p>
+            <w:pPr>
+              <w:spacing w:after="0" w:line="240" w:lineRule="auto"/>
+            </w:pPr>
+            <w:r>
+              <w:rPr>
+                <w:rFonts w:ascii="Calibri" w:hAnsi="Calibri"/>
+                <w:b w:val="0"/>
+                <w:sz w:val="20"/>
+              </w:rPr>
+              <w:t>332,705</w:t>
+            </w:r>
+          </w:p>
+        </w:tc>
+        <w:tc>
+          <w:tcPr>
+            <w:tcW w:type="dxa" w:w="1944"/>
+            <w:vAlign w:val="center"/>
+            <w:tcBorders>
+              <w:top w:val="single" w:sz="4" w:color="D9D9D9"/>
+              <w:left w:val="single" w:sz="4" w:color="D9D9D9"/>
+              <w:bottom w:val="single" w:sz="4" w:color="D9D9D9"/>
+              <w:right w:val="single" w:sz="4" w:color="D9D9D9"/>
+            </w:tcBorders>
+            <w:tcMar>
+              <w:top w:w="70" w:type="dxa"/>
+              <w:left w:w="70" w:type="dxa"/>
+              <w:bottom w:w="70" w:type="dxa"/>
+              <w:right w:w="70" w:type="dxa"/>
+            </w:tcMar>
+          </w:tcPr>
+          <w:p>
+            <w:pPr>
+              <w:spacing w:after="0" w:line="240" w:lineRule="auto"/>
+            </w:pPr>
+            <w:r>
+              <w:rPr>
+                <w:rFonts w:ascii="Calibri" w:hAnsi="Calibri"/>
+                <w:b w:val="0"/>
+                <w:sz w:val="20"/>
+              </w:rPr>
+              <w:t>88.94%</w:t>
+            </w:r>
+          </w:p>
+        </w:tc>
+        <w:tc>
+          <w:tcPr>
+            <w:tcW w:type="dxa" w:w="864"/>
+            <w:vAlign w:val="center"/>
+            <w:tcBorders>
+              <w:top w:val="single" w:sz="4" w:color="D9D9D9"/>
+              <w:left w:val="single" w:sz="4" w:color="D9D9D9"/>
+              <w:bottom w:val="single" w:sz="4" w:color="D9D9D9"/>
+              <w:right w:val="single" w:sz="4" w:color="D9D9D9"/>
+            </w:tcBorders>
+            <w:tcMar>
+              <w:top w:w="70" w:type="dxa"/>
+              <w:left w:w="70" w:type="dxa"/>
+              <w:bottom w:w="70" w:type="dxa"/>
+              <w:right w:w="70" w:type="dxa"/>
+            </w:tcMar>
+          </w:tcPr>
+          <w:p>
+            <w:pPr>
+              <w:spacing w:after="0" w:line="240" w:lineRule="auto"/>
+            </w:pPr>
+            <w:r>
+              <w:rPr>
+                <w:rFonts w:ascii="Calibri" w:hAnsi="Calibri"/>
+                <w:b w:val="0"/>
+                <w:sz w:val="20"/>
+              </w:rPr>
+              <w:t>6</w:t>
+            </w:r>
+          </w:p>
+        </w:tc>
+        <w:tc>
+          <w:tcPr>
+            <w:tcW w:type="dxa" w:w="1584"/>
+            <w:vAlign w:val="center"/>
+            <w:tcBorders>
+              <w:top w:val="single" w:sz="4" w:color="D9D9D9"/>
+              <w:left w:val="single" w:sz="4" w:color="D9D9D9"/>
+              <w:bottom w:val="single" w:sz="4" w:color="D9D9D9"/>
+              <w:right w:val="single" w:sz="4" w:color="D9D9D9"/>
+            </w:tcBorders>
+            <w:tcMar>
+              <w:top w:w="70" w:type="dxa"/>
+              <w:left w:w="70" w:type="dxa"/>
+              <w:bottom w:w="70" w:type="dxa"/>
+              <w:right w:w="70" w:type="dxa"/>
+            </w:tcMar>
+          </w:tcPr>
+          <w:p>
+            <w:pPr>
+              <w:spacing w:after="0" w:line="240" w:lineRule="auto"/>
+            </w:pPr>
+            <w:r>
+              <w:rPr>
+                <w:rFonts w:ascii="Calibri" w:hAnsi="Calibri"/>
+                <w:b w:val="0"/>
+                <w:sz w:val="20"/>
+              </w:rPr>
+              <w:t>0.2877</w:t>
+            </w:r>
+          </w:p>
+        </w:tc>
+      </w:tr>
+      <w:tr>
+        <w:trPr>
+          <w:cantSplit/>
+        </w:trPr>
+        <w:tc>
+          <w:tcPr>
+            <w:tcW w:type="dxa" w:w="1440"/>
+            <w:vAlign w:val="center"/>
+            <w:tcBorders>
+              <w:top w:val="single" w:sz="4" w:color="D9D9D9"/>
+              <w:left w:val="single" w:sz="4" w:color="D9D9D9"/>
+              <w:bottom w:val="single" w:sz="4" w:color="D9D9D9"/>
+              <w:right w:val="single" w:sz="4" w:color="D9D9D9"/>
+            </w:tcBorders>
+            <w:tcMar>
+              <w:top w:w="70" w:type="dxa"/>
+              <w:left w:w="70" w:type="dxa"/>
+              <w:bottom w:w="70" w:type="dxa"/>
+              <w:right w:w="70" w:type="dxa"/>
+            </w:tcMar>
+          </w:tcPr>
+          <w:p>
+            <w:pPr>
+              <w:spacing w:after="0" w:line="240" w:lineRule="auto"/>
+            </w:pPr>
+            <w:r>
+              <w:rPr>
+                <w:rFonts w:ascii="Calibri" w:hAnsi="Calibri"/>
+                <w:b w:val="0"/>
+                <w:sz w:val="20"/>
+              </w:rPr>
+              <w:t>GRU</w:t>
+            </w:r>
+          </w:p>
+        </w:tc>
+        <w:tc>
+          <w:tcPr>
+            <w:tcW w:type="dxa" w:w="864"/>
+            <w:vAlign w:val="center"/>
+            <w:tcBorders>
+              <w:top w:val="single" w:sz="4" w:color="D9D9D9"/>
+              <w:left w:val="single" w:sz="4" w:color="D9D9D9"/>
+              <w:bottom w:val="single" w:sz="4" w:color="D9D9D9"/>
+              <w:right w:val="single" w:sz="4" w:color="D9D9D9"/>
+            </w:tcBorders>
+            <w:tcMar>
+              <w:top w:w="70" w:type="dxa"/>
+              <w:left w:w="70" w:type="dxa"/>
+              <w:bottom w:w="70" w:type="dxa"/>
+              <w:right w:w="70" w:type="dxa"/>
+            </w:tcMar>
+          </w:tcPr>
+          <w:p>
+            <w:pPr>
+              <w:spacing w:after="0" w:line="240" w:lineRule="auto"/>
+            </w:pPr>
+            <w:r>
+              <w:rPr>
+                <w:rFonts w:ascii="Calibri" w:hAnsi="Calibri"/>
+                <w:b w:val="0"/>
+                <w:sz w:val="20"/>
+              </w:rPr>
+              <w:t>3</w:t>
+            </w:r>
+          </w:p>
+        </w:tc>
+        <w:tc>
+          <w:tcPr>
+            <w:tcW w:type="dxa" w:w="1584"/>
+            <w:vAlign w:val="center"/>
+            <w:tcBorders>
+              <w:top w:val="single" w:sz="4" w:color="D9D9D9"/>
+              <w:left w:val="single" w:sz="4" w:color="D9D9D9"/>
+              <w:bottom w:val="single" w:sz="4" w:color="D9D9D9"/>
+              <w:right w:val="single" w:sz="4" w:color="D9D9D9"/>
+            </w:tcBorders>
+            <w:tcMar>
+              <w:top w:w="70" w:type="dxa"/>
+              <w:left w:w="70" w:type="dxa"/>
+              <w:bottom w:w="70" w:type="dxa"/>
+              <w:right w:w="70" w:type="dxa"/>
+            </w:tcMar>
+          </w:tcPr>
+          <w:p>
+            <w:pPr>
+              <w:spacing w:after="0" w:line="240" w:lineRule="auto"/>
+            </w:pPr>
+            <w:r>
+              <w:rPr>
+                <w:rFonts w:ascii="Calibri" w:hAnsi="Calibri"/>
+                <w:b w:val="0"/>
+                <w:sz w:val="20"/>
+              </w:rPr>
+              <w:t>339,041</w:t>
+            </w:r>
+          </w:p>
+        </w:tc>
+        <w:tc>
+          <w:tcPr>
+            <w:tcW w:type="dxa" w:w="1944"/>
+            <w:vAlign w:val="center"/>
+            <w:tcBorders>
+              <w:top w:val="single" w:sz="4" w:color="D9D9D9"/>
+              <w:left w:val="single" w:sz="4" w:color="D9D9D9"/>
+              <w:bottom w:val="single" w:sz="4" w:color="D9D9D9"/>
+              <w:right w:val="single" w:sz="4" w:color="D9D9D9"/>
+            </w:tcBorders>
+            <w:tcMar>
+              <w:top w:w="70" w:type="dxa"/>
+              <w:left w:w="70" w:type="dxa"/>
+              <w:bottom w:w="70" w:type="dxa"/>
+              <w:right w:w="70" w:type="dxa"/>
+            </w:tcMar>
+          </w:tcPr>
+          <w:p>
+            <w:pPr>
+              <w:spacing w:after="0" w:line="240" w:lineRule="auto"/>
+            </w:pPr>
+            <w:r>
+              <w:rPr>
+                <w:rFonts w:ascii="Calibri" w:hAnsi="Calibri"/>
+                <w:b w:val="0"/>
+                <w:sz w:val="20"/>
+              </w:rPr>
+              <w:t>89.38%</w:t>
+            </w:r>
+          </w:p>
+        </w:tc>
+        <w:tc>
+          <w:tcPr>
+            <w:tcW w:type="dxa" w:w="864"/>
+            <w:vAlign w:val="center"/>
+            <w:tcBorders>
+              <w:top w:val="single" w:sz="4" w:color="D9D9D9"/>
+              <w:left w:val="single" w:sz="4" w:color="D9D9D9"/>
+              <w:bottom w:val="single" w:sz="4" w:color="D9D9D9"/>
+              <w:right w:val="single" w:sz="4" w:color="D9D9D9"/>
+            </w:tcBorders>
+            <w:tcMar>
+              <w:top w:w="70" w:type="dxa"/>
+              <w:left w:w="70" w:type="dxa"/>
+              <w:bottom w:w="70" w:type="dxa"/>
+              <w:right w:w="70" w:type="dxa"/>
+            </w:tcMar>
+          </w:tcPr>
+          <w:p>
+            <w:pPr>
+              <w:spacing w:after="0" w:line="240" w:lineRule="auto"/>
+            </w:pPr>
+            <w:r>
+              <w:rPr>
+                <w:rFonts w:ascii="Calibri" w:hAnsi="Calibri"/>
+                <w:b w:val="0"/>
+                <w:sz w:val="20"/>
+              </w:rPr>
+              <w:t>3</w:t>
+            </w:r>
+          </w:p>
+        </w:tc>
+        <w:tc>
+          <w:tcPr>
+            <w:tcW w:type="dxa" w:w="1584"/>
+            <w:vAlign w:val="center"/>
+            <w:tcBorders>
+              <w:top w:val="single" w:sz="4" w:color="D9D9D9"/>
+              <w:left w:val="single" w:sz="4" w:color="D9D9D9"/>
+              <w:bottom w:val="single" w:sz="4" w:color="D9D9D9"/>
+              <w:right w:val="single" w:sz="4" w:color="D9D9D9"/>
+            </w:tcBorders>
+            <w:tcMar>
+              <w:top w:w="70" w:type="dxa"/>
+              <w:left w:w="70" w:type="dxa"/>
+              <w:bottom w:w="70" w:type="dxa"/>
+              <w:right w:w="70" w:type="dxa"/>
+            </w:tcMar>
+          </w:tcPr>
+          <w:p>
+            <w:pPr>
+              <w:spacing w:after="0" w:line="240" w:lineRule="auto"/>
+            </w:pPr>
+            <w:r>
+              <w:rPr>
+                <w:rFonts w:ascii="Calibri" w:hAnsi="Calibri"/>
+                <w:b w:val="0"/>
+                <w:sz w:val="20"/>
+              </w:rPr>
+              <w:t>0.2724</w:t>
+            </w:r>
+          </w:p>
+        </w:tc>
+      </w:tr>
+      <w:tr>
+        <w:trPr>
+          <w:cantSplit/>
+        </w:trPr>
+        <w:tc>
+          <w:tcPr>
+            <w:tcW w:type="dxa" w:w="1440"/>
+            <w:vAlign w:val="center"/>
+            <w:tcBorders>
+              <w:top w:val="single" w:sz="4" w:color="D9D9D9"/>
+              <w:left w:val="single" w:sz="4" w:color="D9D9D9"/>
+              <w:bottom w:val="single" w:sz="4" w:color="D9D9D9"/>
+              <w:right w:val="single" w:sz="4" w:color="D9D9D9"/>
+            </w:tcBorders>
+            <w:tcMar>
+              <w:top w:w="70" w:type="dxa"/>
+              <w:left w:w="70" w:type="dxa"/>
+              <w:bottom w:w="70" w:type="dxa"/>
+              <w:right w:w="70" w:type="dxa"/>
+            </w:tcMar>
+          </w:tcPr>
+          <w:p>
+            <w:pPr>
+              <w:spacing w:after="0" w:line="240" w:lineRule="auto"/>
+            </w:pPr>
+            <w:r>
+              <w:rPr>
+                <w:rFonts w:ascii="Calibri" w:hAnsi="Calibri"/>
+                <w:b w:val="0"/>
+                <w:sz w:val="20"/>
+              </w:rPr>
+              <w:t>LSTM</w:t>
+            </w:r>
+          </w:p>
+        </w:tc>
+        <w:tc>
+          <w:tcPr>
+            <w:tcW w:type="dxa" w:w="864"/>
+            <w:vAlign w:val="center"/>
+            <w:tcBorders>
+              <w:top w:val="single" w:sz="4" w:color="D9D9D9"/>
+              <w:left w:val="single" w:sz="4" w:color="D9D9D9"/>
+              <w:bottom w:val="single" w:sz="4" w:color="D9D9D9"/>
+              <w:right w:val="single" w:sz="4" w:color="D9D9D9"/>
+            </w:tcBorders>
+            <w:tcMar>
+              <w:top w:w="70" w:type="dxa"/>
+              <w:left w:w="70" w:type="dxa"/>
+              <w:bottom w:w="70" w:type="dxa"/>
+              <w:right w:w="70" w:type="dxa"/>
+            </w:tcMar>
+          </w:tcPr>
+          <w:p>
+            <w:pPr>
+              <w:spacing w:after="0" w:line="240" w:lineRule="auto"/>
+            </w:pPr>
+            <w:r>
+              <w:rPr>
+                <w:rFonts w:ascii="Calibri" w:hAnsi="Calibri"/>
+                <w:b w:val="0"/>
+                <w:sz w:val="20"/>
+              </w:rPr>
+              <w:t>1</w:t>
+            </w:r>
+          </w:p>
+        </w:tc>
+        <w:tc>
+          <w:tcPr>
+            <w:tcW w:type="dxa" w:w="1584"/>
+            <w:vAlign w:val="center"/>
+            <w:tcBorders>
+              <w:top w:val="single" w:sz="4" w:color="D9D9D9"/>
+              <w:left w:val="single" w:sz="4" w:color="D9D9D9"/>
+              <w:bottom w:val="single" w:sz="4" w:color="D9D9D9"/>
+              <w:right w:val="single" w:sz="4" w:color="D9D9D9"/>
+            </w:tcBorders>
+            <w:tcMar>
+              <w:top w:w="70" w:type="dxa"/>
+              <w:left w:w="70" w:type="dxa"/>
+              <w:bottom w:w="70" w:type="dxa"/>
+              <w:right w:w="70" w:type="dxa"/>
+            </w:tcMar>
+          </w:tcPr>
+          <w:p>
+            <w:pPr>
+              <w:spacing w:after="0" w:line="240" w:lineRule="auto"/>
+            </w:pPr>
+            <w:r>
+              <w:rPr>
+                <w:rFonts w:ascii="Calibri" w:hAnsi="Calibri"/>
+                <w:b w:val="0"/>
+                <w:sz w:val="20"/>
+              </w:rPr>
+              <w:t>328,353</w:t>
+            </w:r>
+          </w:p>
+        </w:tc>
+        <w:tc>
+          <w:tcPr>
+            <w:tcW w:type="dxa" w:w="1944"/>
+            <w:vAlign w:val="center"/>
+            <w:tcBorders>
+              <w:top w:val="single" w:sz="4" w:color="D9D9D9"/>
+              <w:left w:val="single" w:sz="4" w:color="D9D9D9"/>
+              <w:bottom w:val="single" w:sz="4" w:color="D9D9D9"/>
+              <w:right w:val="single" w:sz="4" w:color="D9D9D9"/>
+            </w:tcBorders>
+            <w:tcMar>
+              <w:top w:w="70" w:type="dxa"/>
+              <w:left w:w="70" w:type="dxa"/>
+              <w:bottom w:w="70" w:type="dxa"/>
+              <w:right w:w="70" w:type="dxa"/>
+            </w:tcMar>
+          </w:tcPr>
+          <w:p>
+            <w:pPr>
+              <w:spacing w:after="0" w:line="240" w:lineRule="auto"/>
+            </w:pPr>
+            <w:r>
+              <w:rPr>
+                <w:rFonts w:ascii="Calibri" w:hAnsi="Calibri"/>
+                <w:b w:val="0"/>
+                <w:sz w:val="20"/>
+              </w:rPr>
+              <w:t>88.54%</w:t>
+            </w:r>
+          </w:p>
+        </w:tc>
+        <w:tc>
+          <w:tcPr>
+            <w:tcW w:type="dxa" w:w="864"/>
+            <w:vAlign w:val="center"/>
+            <w:tcBorders>
+              <w:top w:val="single" w:sz="4" w:color="D9D9D9"/>
+              <w:left w:val="single" w:sz="4" w:color="D9D9D9"/>
+              <w:bottom w:val="single" w:sz="4" w:color="D9D9D9"/>
+              <w:right w:val="single" w:sz="4" w:color="D9D9D9"/>
+            </w:tcBorders>
+            <w:tcMar>
+              <w:top w:w="70" w:type="dxa"/>
+              <w:left w:w="70" w:type="dxa"/>
+              <w:bottom w:w="70" w:type="dxa"/>
+              <w:right w:w="70" w:type="dxa"/>
+            </w:tcMar>
+          </w:tcPr>
+          <w:p>
+            <w:pPr>
+              <w:spacing w:after="0" w:line="240" w:lineRule="auto"/>
+            </w:pPr>
+            <w:r>
+              <w:rPr>
+                <w:rFonts w:ascii="Calibri" w:hAnsi="Calibri"/>
+                <w:b w:val="0"/>
+                <w:sz w:val="20"/>
+              </w:rPr>
+              <w:t>3</w:t>
+            </w:r>
+          </w:p>
+        </w:tc>
+        <w:tc>
+          <w:tcPr>
+            <w:tcW w:type="dxa" w:w="1584"/>
+            <w:vAlign w:val="center"/>
+            <w:tcBorders>
+              <w:top w:val="single" w:sz="4" w:color="D9D9D9"/>
+              <w:left w:val="single" w:sz="4" w:color="D9D9D9"/>
+              <w:bottom w:val="single" w:sz="4" w:color="D9D9D9"/>
+              <w:right w:val="single" w:sz="4" w:color="D9D9D9"/>
+            </w:tcBorders>
+            <w:tcMar>
+              <w:top w:w="70" w:type="dxa"/>
+              <w:left w:w="70" w:type="dxa"/>
+              <w:bottom w:w="70" w:type="dxa"/>
+              <w:right w:w="70" w:type="dxa"/>
+            </w:tcMar>
+          </w:tcPr>
+          <w:p>
+            <w:pPr>
+              <w:spacing w:after="0" w:line="240" w:lineRule="auto"/>
+            </w:pPr>
+            <w:r>
+              <w:rPr>
+                <w:rFonts w:ascii="Calibri" w:hAnsi="Calibri"/>
+                <w:b w:val="0"/>
+                <w:sz w:val="20"/>
+              </w:rPr>
+              <w:t>0.2939</w:t>
+            </w:r>
+          </w:p>
+        </w:tc>
+      </w:tr>
+      <w:tr>
+        <w:trPr>
+          <w:cantSplit/>
+        </w:trPr>
+        <w:tc>
+          <w:tcPr>
+            <w:tcW w:type="dxa" w:w="1440"/>
+            <w:vAlign w:val="center"/>
+            <w:tcBorders>
+              <w:top w:val="single" w:sz="4" w:color="D9D9D9"/>
+              <w:left w:val="single" w:sz="4" w:color="D9D9D9"/>
+              <w:bottom w:val="single" w:sz="4" w:color="D9D9D9"/>
+              <w:right w:val="single" w:sz="4" w:color="D9D9D9"/>
+            </w:tcBorders>
+            <w:tcMar>
+              <w:top w:w="70" w:type="dxa"/>
+              <w:left w:w="70" w:type="dxa"/>
+              <w:bottom w:w="70" w:type="dxa"/>
+              <w:right w:w="70" w:type="dxa"/>
+            </w:tcMar>
+          </w:tcPr>
+          <w:p>
+            <w:pPr>
+              <w:spacing w:after="0" w:line="240" w:lineRule="auto"/>
+            </w:pPr>
+            <w:r>
+              <w:rPr>
+                <w:rFonts w:ascii="Calibri" w:hAnsi="Calibri"/>
+                <w:b w:val="0"/>
+                <w:sz w:val="20"/>
+              </w:rPr>
+              <w:t>LSTM</w:t>
+            </w:r>
+          </w:p>
+        </w:tc>
+        <w:tc>
+          <w:tcPr>
+            <w:tcW w:type="dxa" w:w="864"/>
+            <w:vAlign w:val="center"/>
+            <w:tcBorders>
+              <w:top w:val="single" w:sz="4" w:color="D9D9D9"/>
+              <w:left w:val="single" w:sz="4" w:color="D9D9D9"/>
+              <w:bottom w:val="single" w:sz="4" w:color="D9D9D9"/>
+              <w:right w:val="single" w:sz="4" w:color="D9D9D9"/>
+            </w:tcBorders>
+            <w:tcMar>
+              <w:top w:w="70" w:type="dxa"/>
+              <w:left w:w="70" w:type="dxa"/>
+              <w:bottom w:w="70" w:type="dxa"/>
+              <w:right w:w="70" w:type="dxa"/>
+            </w:tcMar>
+          </w:tcPr>
+          <w:p>
+            <w:pPr>
+              <w:spacing w:after="0" w:line="240" w:lineRule="auto"/>
+            </w:pPr>
+            <w:r>
+              <w:rPr>
+                <w:rFonts w:ascii="Calibri" w:hAnsi="Calibri"/>
+                <w:b w:val="0"/>
+                <w:sz w:val="20"/>
+              </w:rPr>
+              <w:t>2</w:t>
+            </w:r>
+          </w:p>
+        </w:tc>
+        <w:tc>
+          <w:tcPr>
+            <w:tcW w:type="dxa" w:w="1584"/>
+            <w:vAlign w:val="center"/>
+            <w:tcBorders>
+              <w:top w:val="single" w:sz="4" w:color="D9D9D9"/>
+              <w:left w:val="single" w:sz="4" w:color="D9D9D9"/>
+              <w:bottom w:val="single" w:sz="4" w:color="D9D9D9"/>
+              <w:right w:val="single" w:sz="4" w:color="D9D9D9"/>
+            </w:tcBorders>
+            <w:tcMar>
+              <w:top w:w="70" w:type="dxa"/>
+              <w:left w:w="70" w:type="dxa"/>
+              <w:bottom w:w="70" w:type="dxa"/>
+              <w:right w:w="70" w:type="dxa"/>
+            </w:tcMar>
+          </w:tcPr>
+          <w:p>
+            <w:pPr>
+              <w:spacing w:after="0" w:line="240" w:lineRule="auto"/>
+            </w:pPr>
+            <w:r>
+              <w:rPr>
+                <w:rFonts w:ascii="Calibri" w:hAnsi="Calibri"/>
+                <w:b w:val="0"/>
+                <w:sz w:val="20"/>
+              </w:rPr>
+              <w:t>336,673</w:t>
+            </w:r>
+          </w:p>
+        </w:tc>
+        <w:tc>
+          <w:tcPr>
+            <w:tcW w:type="dxa" w:w="1944"/>
+            <w:vAlign w:val="center"/>
+            <w:tcBorders>
+              <w:top w:val="single" w:sz="4" w:color="D9D9D9"/>
+              <w:left w:val="single" w:sz="4" w:color="D9D9D9"/>
+              <w:bottom w:val="single" w:sz="4" w:color="D9D9D9"/>
+              <w:right w:val="single" w:sz="4" w:color="D9D9D9"/>
+            </w:tcBorders>
+            <w:tcMar>
+              <w:top w:w="70" w:type="dxa"/>
+              <w:left w:w="70" w:type="dxa"/>
+              <w:bottom w:w="70" w:type="dxa"/>
+              <w:right w:w="70" w:type="dxa"/>
+            </w:tcMar>
+          </w:tcPr>
+          <w:p>
+            <w:pPr>
+              <w:spacing w:after="0" w:line="240" w:lineRule="auto"/>
+            </w:pPr>
+            <w:r>
+              <w:rPr>
+                <w:rFonts w:ascii="Calibri" w:hAnsi="Calibri"/>
+                <w:b w:val="0"/>
+                <w:sz w:val="20"/>
+              </w:rPr>
+              <w:t>88.90%</w:t>
+            </w:r>
+          </w:p>
+        </w:tc>
+        <w:tc>
+          <w:tcPr>
+            <w:tcW w:type="dxa" w:w="864"/>
+            <w:vAlign w:val="center"/>
+            <w:tcBorders>
+              <w:top w:val="single" w:sz="4" w:color="D9D9D9"/>
+              <w:left w:val="single" w:sz="4" w:color="D9D9D9"/>
+              <w:bottom w:val="single" w:sz="4" w:color="D9D9D9"/>
+              <w:right w:val="single" w:sz="4" w:color="D9D9D9"/>
+            </w:tcBorders>
+            <w:tcMar>
+              <w:top w:w="70" w:type="dxa"/>
+              <w:left w:w="70" w:type="dxa"/>
+              <w:bottom w:w="70" w:type="dxa"/>
+              <w:right w:w="70" w:type="dxa"/>
+            </w:tcMar>
+          </w:tcPr>
+          <w:p>
+            <w:pPr>
+              <w:spacing w:after="0" w:line="240" w:lineRule="auto"/>
+            </w:pPr>
+            <w:r>
+              <w:rPr>
+                <w:rFonts w:ascii="Calibri" w:hAnsi="Calibri"/>
+                <w:b w:val="0"/>
+                <w:sz w:val="20"/>
+              </w:rPr>
+              <w:t>2</w:t>
+            </w:r>
+          </w:p>
+        </w:tc>
+        <w:tc>
+          <w:tcPr>
+            <w:tcW w:type="dxa" w:w="1584"/>
+            <w:vAlign w:val="center"/>
+            <w:tcBorders>
+              <w:top w:val="single" w:sz="4" w:color="D9D9D9"/>
+              <w:left w:val="single" w:sz="4" w:color="D9D9D9"/>
+              <w:bottom w:val="single" w:sz="4" w:color="D9D9D9"/>
+              <w:right w:val="single" w:sz="4" w:color="D9D9D9"/>
+            </w:tcBorders>
+            <w:tcMar>
+              <w:top w:w="70" w:type="dxa"/>
+              <w:left w:w="70" w:type="dxa"/>
+              <w:bottom w:w="70" w:type="dxa"/>
+              <w:right w:w="70" w:type="dxa"/>
+            </w:tcMar>
+          </w:tcPr>
+          <w:p>
+            <w:pPr>
+              <w:spacing w:after="0" w:line="240" w:lineRule="auto"/>
+            </w:pPr>
+            <w:r>
+              <w:rPr>
+                <w:rFonts w:ascii="Calibri" w:hAnsi="Calibri"/>
+                <w:b w:val="0"/>
+                <w:sz w:val="20"/>
+              </w:rPr>
+              <w:t>0.2727</w:t>
+            </w:r>
+          </w:p>
+        </w:tc>
+      </w:tr>
+      <w:tr>
+        <w:trPr>
+          <w:cantSplit/>
+        </w:trPr>
+        <w:tc>
+          <w:tcPr>
+            <w:tcW w:type="dxa" w:w="1440"/>
+            <w:vAlign w:val="center"/>
+            <w:tcBorders>
+              <w:top w:val="single" w:sz="4" w:color="D9D9D9"/>
+              <w:left w:val="single" w:sz="4" w:color="D9D9D9"/>
+              <w:bottom w:val="single" w:sz="4" w:color="D9D9D9"/>
+              <w:right w:val="single" w:sz="4" w:color="D9D9D9"/>
+            </w:tcBorders>
+            <w:tcMar>
+              <w:top w:w="70" w:type="dxa"/>
+              <w:left w:w="70" w:type="dxa"/>
+              <w:bottom w:w="70" w:type="dxa"/>
+              <w:right w:w="70" w:type="dxa"/>
+            </w:tcMar>
+          </w:tcPr>
+          <w:p>
+            <w:pPr>
+              <w:spacing w:after="0" w:line="240" w:lineRule="auto"/>
+            </w:pPr>
+            <w:r>
+              <w:rPr>
+                <w:rFonts w:ascii="Calibri" w:hAnsi="Calibri"/>
+                <w:b w:val="0"/>
+                <w:sz w:val="20"/>
+              </w:rPr>
+              <w:t>LSTM</w:t>
+            </w:r>
+          </w:p>
+        </w:tc>
+        <w:tc>
+          <w:tcPr>
+            <w:tcW w:type="dxa" w:w="864"/>
+            <w:vAlign w:val="center"/>
+            <w:tcBorders>
+              <w:top w:val="single" w:sz="4" w:color="D9D9D9"/>
+              <w:left w:val="single" w:sz="4" w:color="D9D9D9"/>
+              <w:bottom w:val="single" w:sz="4" w:color="D9D9D9"/>
+              <w:right w:val="single" w:sz="4" w:color="D9D9D9"/>
+            </w:tcBorders>
+            <w:tcMar>
+              <w:top w:w="70" w:type="dxa"/>
+              <w:left w:w="70" w:type="dxa"/>
+              <w:bottom w:w="70" w:type="dxa"/>
+              <w:right w:w="70" w:type="dxa"/>
+            </w:tcMar>
+          </w:tcPr>
+          <w:p>
+            <w:pPr>
+              <w:spacing w:after="0" w:line="240" w:lineRule="auto"/>
+            </w:pPr>
+            <w:r>
+              <w:rPr>
+                <w:rFonts w:ascii="Calibri" w:hAnsi="Calibri"/>
+                <w:b w:val="0"/>
+                <w:sz w:val="20"/>
+              </w:rPr>
+              <w:t>3</w:t>
+            </w:r>
+          </w:p>
+        </w:tc>
+        <w:tc>
+          <w:tcPr>
+            <w:tcW w:type="dxa" w:w="1584"/>
+            <w:vAlign w:val="center"/>
+            <w:tcBorders>
+              <w:top w:val="single" w:sz="4" w:color="D9D9D9"/>
+              <w:left w:val="single" w:sz="4" w:color="D9D9D9"/>
+              <w:bottom w:val="single" w:sz="4" w:color="D9D9D9"/>
+              <w:right w:val="single" w:sz="4" w:color="D9D9D9"/>
+            </w:tcBorders>
+            <w:tcMar>
+              <w:top w:w="70" w:type="dxa"/>
+              <w:left w:w="70" w:type="dxa"/>
+              <w:bottom w:w="70" w:type="dxa"/>
+              <w:right w:w="70" w:type="dxa"/>
+            </w:tcMar>
+          </w:tcPr>
+          <w:p>
+            <w:pPr>
+              <w:spacing w:after="0" w:line="240" w:lineRule="auto"/>
+            </w:pPr>
+            <w:r>
+              <w:rPr>
+                <w:rFonts w:ascii="Calibri" w:hAnsi="Calibri"/>
+                <w:b w:val="0"/>
+                <w:sz w:val="20"/>
+              </w:rPr>
+              <w:t>344,993</w:t>
+            </w:r>
+          </w:p>
+        </w:tc>
+        <w:tc>
+          <w:tcPr>
+            <w:tcW w:type="dxa" w:w="1944"/>
+            <w:vAlign w:val="center"/>
+            <w:tcBorders>
+              <w:top w:val="single" w:sz="4" w:color="D9D9D9"/>
+              <w:left w:val="single" w:sz="4" w:color="D9D9D9"/>
+              <w:bottom w:val="single" w:sz="4" w:color="D9D9D9"/>
+              <w:right w:val="single" w:sz="4" w:color="D9D9D9"/>
+            </w:tcBorders>
+            <w:tcMar>
+              <w:top w:w="70" w:type="dxa"/>
+              <w:left w:w="70" w:type="dxa"/>
+              <w:bottom w:w="70" w:type="dxa"/>
+              <w:right w:w="70" w:type="dxa"/>
+            </w:tcMar>
+          </w:tcPr>
+          <w:p>
+            <w:pPr>
+              <w:spacing w:after="0" w:line="240" w:lineRule="auto"/>
+            </w:pPr>
+            <w:r>
+              <w:rPr>
+                <w:rFonts w:ascii="Calibri" w:hAnsi="Calibri"/>
+                <w:b w:val="0"/>
+                <w:sz w:val="20"/>
+              </w:rPr>
+              <w:t>88.66%</w:t>
+            </w:r>
+          </w:p>
+        </w:tc>
+        <w:tc>
+          <w:tcPr>
+            <w:tcW w:type="dxa" w:w="864"/>
+            <w:vAlign w:val="center"/>
+            <w:tcBorders>
+              <w:top w:val="single" w:sz="4" w:color="D9D9D9"/>
+              <w:left w:val="single" w:sz="4" w:color="D9D9D9"/>
+              <w:bottom w:val="single" w:sz="4" w:color="D9D9D9"/>
+              <w:right w:val="single" w:sz="4" w:color="D9D9D9"/>
+            </w:tcBorders>
+            <w:tcMar>
+              <w:top w:w="70" w:type="dxa"/>
+              <w:left w:w="70" w:type="dxa"/>
+              <w:bottom w:w="70" w:type="dxa"/>
+              <w:right w:w="70" w:type="dxa"/>
+            </w:tcMar>
+          </w:tcPr>
+          <w:p>
+            <w:pPr>
+              <w:spacing w:after="0" w:line="240" w:lineRule="auto"/>
+            </w:pPr>
+            <w:r>
+              <w:rPr>
+                <w:rFonts w:ascii="Calibri" w:hAnsi="Calibri"/>
+                <w:b w:val="0"/>
+                <w:sz w:val="20"/>
+              </w:rPr>
+              <w:t>3</w:t>
+            </w:r>
+          </w:p>
+        </w:tc>
+        <w:tc>
+          <w:tcPr>
+            <w:tcW w:type="dxa" w:w="1584"/>
+            <w:vAlign w:val="center"/>
+            <w:tcBorders>
+              <w:top w:val="single" w:sz="4" w:color="D9D9D9"/>
+              <w:left w:val="single" w:sz="4" w:color="D9D9D9"/>
+              <w:bottom w:val="single" w:sz="4" w:color="D9D9D9"/>
+              <w:right w:val="single" w:sz="4" w:color="D9D9D9"/>
+            </w:tcBorders>
+            <w:tcMar>
+              <w:top w:w="70" w:type="dxa"/>
+              <w:left w:w="70" w:type="dxa"/>
+              <w:bottom w:w="70" w:type="dxa"/>
+              <w:right w:w="70" w:type="dxa"/>
+            </w:tcMar>
+          </w:tcPr>
+          <w:p>
+            <w:pPr>
+              <w:spacing w:after="0" w:line="240" w:lineRule="auto"/>
+            </w:pPr>
+            <w:r>
+              <w:rPr>
+                <w:rFonts w:ascii="Calibri" w:hAnsi="Calibri"/>
+                <w:b w:val="0"/>
+                <w:sz w:val="20"/>
+              </w:rPr>
+              <w:t>0.2898</w:t>
+            </w:r>
+          </w:p>
+        </w:tc>
+      </w:tr>
+    </w:tbl>
+    <w:p>
+      <w:pPr>
+        <w:spacing w:after="140" w:line="254" w:lineRule="auto"/>
+      </w:pPr>
+      <w:r>
+        <w:rPr>
+          <w:rFonts w:ascii="Calibri" w:hAnsi="Calibri"/>
+          <w:b w:val="0"/>
+          <w:sz w:val="22"/>
+        </w:rPr>
+        <w:t>Best accuracy means the maximum validation accuracy over the 15 epochs; related loss is the validation loss at that same epoch. When accuracy is tied, the lower associated loss is preferred. In this comparison, the selected GRU also has the lowest validation loss overall, so the accuracy and loss criteria agree.</w:t>
+      </w:r>
+    </w:p>
+    <w:p>
+      <w:pPr>
+        <w:keepNext/>
+        <w:spacing w:after="140" w:line="254" w:lineRule="auto"/>
+      </w:pPr>
+      <w:r>
+        <w:rPr>
+          <w:rFonts w:ascii="Calibri" w:hAnsi="Calibri"/>
+          <w:b/>
+          <w:sz w:val="22"/>
+        </w:rPr>
+        <w:t>Why the result is reasonable but not guaranteed</w:t>
+      </w:r>
+    </w:p>
+    <w:p>
+      <w:pPr>
+        <w:spacing w:after="140" w:line="254" w:lineRule="auto"/>
+      </w:pPr>
+      <w:r>
+        <w:rPr>
+          <w:rFonts w:ascii="Calibri" w:hAnsi="Calibri"/>
+          <w:b w:val="0"/>
+          <w:sz w:val="22"/>
+        </w:rPr>
+        <w:t>A simple RNN can struggle to retain information across long reviews because the learning signal can become very small. GRU and LSTM networks use gates that help preserve useful context. It is therefore reasonable to expect gated networks to help with this task, but that expectation must be checked with results.</w:t>
+      </w:r>
+    </w:p>
+    <w:p>
+      <w:pPr>
+        <w:spacing w:after="140" w:line="254" w:lineRule="auto"/>
+      </w:pPr>
+      <w:r>
+        <w:rPr>
+          <w:rFonts w:ascii="Calibri" w:hAnsi="Calibri"/>
+          <w:b w:val="0"/>
+          <w:sz w:val="22"/>
+        </w:rPr>
+        <w:t>The 3-layer GRU can process the word sequence through several stages, allowing later layers to combine patterns learned by earlier layers. The comparison supports this depth for the GRU on this split. More layers are not always better: the 1-layer SimpleRNN and 2-layer LSTM gave the best accuracy within their families. Extra layers can also make optimization harder or increase overfitting.</w:t>
+      </w:r>
+    </w:p>
+    <w:p>
+      <w:pPr>
+        <w:spacing w:after="140" w:line="254" w:lineRule="auto"/>
+      </w:pPr>
+      <w:r>
+        <w:rPr>
+          <w:rFonts w:ascii="Calibri" w:hAnsi="Calibri"/>
+          <w:b w:val="0"/>
+          <w:sz w:val="22"/>
+        </w:rPr>
+        <w:t>The selected GRU has 339,041 parameters. The 2-layer LSTM has 336,673, so the selected GRU is not smaller than that closest competitor. It exceeds the LSTM by 0.48 percentage points in validation accuracy, equivalent to 24 of the 5,000 validation reviews. Their losses differ by only about 0.0003. One split and one seed do not establish that this advantage will persist. Repeated runs and paired prediction comparisons are needed before claiming a reliable general advantage.</w:t>
+      </w:r>
+    </w:p>
+    <w:p>
+      <w:pPr>
+        <w:keepNext/>
+        <w:spacing w:after="140" w:line="254" w:lineRule="auto"/>
+      </w:pPr>
+      <w:r>
+        <w:rPr>
+          <w:rFonts w:ascii="Calibri" w:hAnsi="Calibri"/>
+          <w:b/>
+          <w:sz w:val="22"/>
+        </w:rPr>
+        <w:t>How the selected model predicts sentiment</w:t>
+      </w:r>
+    </w:p>
+    <w:p>
+      <w:pPr>
+        <w:spacing w:after="140" w:line="254" w:lineRule="auto"/>
+      </w:pPr>
+      <w:r>
+        <w:rPr>
+          <w:rFonts w:ascii="Calibri" w:hAnsi="Calibri"/>
+          <w:b w:val="0"/>
+          <w:sz w:val="22"/>
+        </w:rPr>
+        <w:t>Word IDs enter a 32-dimensional embedding, then pass through three GRU layers with 32 units each. The first two GRU layers return a sequence for the next layer; the third returns one summary vector. A sigmoid output converts it into a positive-review probability. A value of at least 0.5 predicts positive; a lower value predicts negative. This is a learned prediction, not a guarantee of correctness.</w:t>
+      </w:r>
+    </w:p>
+    <w:p>
+      <w:pPr>
+        <w:keepNext/>
+        <w:spacing w:after="140" w:line="254" w:lineRule="auto"/>
+      </w:pPr>
+      <w:r>
+        <w:rPr>
+          <w:rFonts w:ascii="Calibri" w:hAnsi="Calibri"/>
+          <w:b/>
+          <w:sz w:val="22"/>
+        </w:rPr>
+        <w:t>Full model run</w:t>
+      </w:r>
+    </w:p>
+    <w:p>
+      <w:pPr>
+        <w:spacing w:after="140" w:line="254" w:lineRule="auto"/>
+      </w:pPr>
+      <w:r>
+        <w:rPr>
+          <w:rFonts w:ascii="Calibri" w:hAnsi="Calibri"/>
+          <w:b w:val="0"/>
+          <w:sz w:val="22"/>
+        </w:rPr>
+        <w:t>The file imdb_lstm.py now builds the selected 3-layer GRU for 35 epochs with the same split and settings. This longer run explores overfitting; improvement is not guaranteed. In results_gru_3_layers, model.keras keeps the lowest-validation-loss checkpoint and final.keras stores epoch 35.</w:t>
+      </w:r>
+    </w:p>
+    <w:p>
+      <w:pPr>
+        <w:spacing w:after="140" w:line="254" w:lineRule="auto"/>
+      </w:pPr>
+      <w:r>
+        <w:rPr>
+          <w:rFonts w:ascii="Calibri" w:hAnsi="Calibri"/>
+          <w:b w:val="0"/>
+          <w:sz w:val="22"/>
+        </w:rPr>
+        <w:t>The tables report the completed 15-epoch comparison, not the separate 35-epoch GRU run. The original LSTM results follow as an initial baseline. Its earlier use of the test split means this test set is not completely untouched across the project.</w:t>
+      </w:r>
+    </w:p>
+    <w:p>
+      <w:r>
+        <w:br w:type="page"/>
+      </w:r>
+    </w:p>
+    <w:p>
+      <w:pPr>
+        <w:pStyle w:val="Heading2"/>
+        <w:keepNext/>
+        <w:spacing w:after="180"/>
+      </w:pPr>
+      <w:r>
+        <w:t>Comparison learning curves</w:t>
+      </w:r>
+    </w:p>
+    <w:p>
+      <w:pPr>
+        <w:keepNext/>
+        <w:spacing w:after="40"/>
+      </w:pPr>
+      <w:r>
+        <w:drawing>
+          <wp:inline>
+            <wp:extent cx="5715000" cy="2143125"/>
+            <wp:docPr id="3" name="Picture 3"/>
+            <wp:cNvGraphicFramePr>
+              <a:graphicFrameLocks noChangeAspect="1"/>
+            </wp:cNvGraphicFramePr>
+            <a:graphic>
+              <a:graphicData uri="http://schemas.openxmlformats.org/drawingml/2006/picture">
+                <pic:pic>
+                  <pic:nvPicPr>
+                    <pic:cNvPr id="0" name="simplernn_comparison.png"/>
+                    <pic:cNvPicPr/>
+                  </pic:nvPicPr>
+                  <pic:blipFill>
+                    <a:blip r:embed="rId9"/>
+                    <a:stretch>
+                      <a:fillRect/>
+                    </a:stretch>
+                  </pic:blipFill>
+                  <pic:spPr>
+                    <a:xfrm>
+                      <a:off x="0" y="0"/>
+                      <a:ext cx="5715000" cy="2143125"/>
+                    </a:xfrm>
+                    <a:prstGeom prst="rect"/>
+                  </pic:spPr>
+                </pic:pic>
+              </a:graphicData>
+            </a:graphic>
+          </wp:inline>
+        </w:drawing>
+      </w:r>
+    </w:p>
+    <w:p>
+      <w:pPr>
+        <w:spacing w:after="140" w:line="254" w:lineRule="auto"/>
+      </w:pPr>
+      <w:r>
+        <w:rPr>
+          <w:rFonts w:ascii="Calibri" w:hAnsi="Calibri"/>
+          <w:b w:val="0"/>
+          <w:sz w:val="22"/>
+        </w:rPr>
+        <w:t>SimpleRNN: training and validation accuracy and loss for 1, 2 and 3 recurrent layers. Dashed lines show training; solid lines show validation.</w:t>
+      </w:r>
+    </w:p>
+    <w:p>
+      <w:pPr>
+        <w:keepNext/>
+        <w:spacing w:after="40"/>
+      </w:pPr>
+      <w:r>
+        <w:drawing>
+          <wp:inline>
+            <wp:extent cx="5715000" cy="2143125"/>
+            <wp:docPr id="4" name="Picture 4"/>
+            <wp:cNvGraphicFramePr>
+              <a:graphicFrameLocks noChangeAspect="1"/>
+            </wp:cNvGraphicFramePr>
+            <a:graphic>
+              <a:graphicData uri="http://schemas.openxmlformats.org/drawingml/2006/picture">
+                <pic:pic>
+                  <pic:nvPicPr>
+                    <pic:cNvPr id="0" name="gru_comparison.png"/>
+                    <pic:cNvPicPr/>
+                  </pic:nvPicPr>
+                  <pic:blipFill>
+                    <a:blip r:embed="rId10"/>
+                    <a:stretch>
+                      <a:fillRect/>
+                    </a:stretch>
+                  </pic:blipFill>
+                  <pic:spPr>
+                    <a:xfrm>
+                      <a:off x="0" y="0"/>
+                      <a:ext cx="5715000" cy="2143125"/>
+                    </a:xfrm>
+                    <a:prstGeom prst="rect"/>
+                  </pic:spPr>
+                </pic:pic>
+              </a:graphicData>
+            </a:graphic>
+          </wp:inline>
+        </w:drawing>
+      </w:r>
+    </w:p>
+    <w:p>
+      <w:pPr>
+        <w:spacing w:after="140" w:line="254" w:lineRule="auto"/>
+      </w:pPr>
+      <w:r>
+        <w:rPr>
+          <w:rFonts w:ascii="Calibri" w:hAnsi="Calibri"/>
+          <w:b w:val="0"/>
+          <w:sz w:val="22"/>
+        </w:rPr>
+        <w:t>GRU: training and validation accuracy and loss for 1, 2 and 3 recurrent layers. Dashed lines show training; solid lines show validation.</w:t>
+      </w:r>
+    </w:p>
+    <w:p>
+      <w:pPr>
+        <w:keepNext/>
+        <w:spacing w:after="40"/>
+      </w:pPr>
+      <w:r>
+        <w:drawing>
+          <wp:inline>
+            <wp:extent cx="5715000" cy="2143125"/>
+            <wp:docPr id="5" name="Picture 5"/>
+            <wp:cNvGraphicFramePr>
+              <a:graphicFrameLocks noChangeAspect="1"/>
+            </wp:cNvGraphicFramePr>
+            <a:graphic>
+              <a:graphicData uri="http://schemas.openxmlformats.org/drawingml/2006/picture">
+                <pic:pic>
+                  <pic:nvPicPr>
+                    <pic:cNvPr id="0" name="lstm_comparison.png"/>
+                    <pic:cNvPicPr/>
+                  </pic:nvPicPr>
+                  <pic:blipFill>
+                    <a:blip r:embed="rId11"/>
+                    <a:stretch>
+                      <a:fillRect/>
+                    </a:stretch>
+                  </pic:blipFill>
+                  <pic:spPr>
+                    <a:xfrm>
+                      <a:off x="0" y="0"/>
+                      <a:ext cx="5715000" cy="2143125"/>
+                    </a:xfrm>
+                    <a:prstGeom prst="rect"/>
+                  </pic:spPr>
+                </pic:pic>
+              </a:graphicData>
+            </a:graphic>
+          </wp:inline>
+        </w:drawing>
+      </w:r>
+    </w:p>
+    <w:p>
+      <w:pPr>
+        <w:spacing w:after="140" w:line="254" w:lineRule="auto"/>
+      </w:pPr>
+      <w:r>
+        <w:rPr>
+          <w:rFonts w:ascii="Calibri" w:hAnsi="Calibri"/>
+          <w:b w:val="0"/>
+          <w:sz w:val="22"/>
+        </w:rPr>
+        <w:t>LSTM: training and validation accuracy and loss for 1, 2 and 3 recurrent layers. Dashed lines show training; solid lines show validation.</w:t>
+      </w:r>
+    </w:p>
+    <w:p>
+      <w:pPr>
+        <w:spacing w:after="140" w:line="254" w:lineRule="auto"/>
+      </w:pPr>
+      <w:r>
+        <w:rPr>
+          <w:rFonts w:ascii="Calibri" w:hAnsi="Calibri"/>
+          <w:b w:val="0"/>
+          <w:sz w:val="22"/>
+        </w:rPr>
+        <w:t>Source: results_recurrent_comparison/20261015_150230_305523, histories.json, config.json and the three comparison figures. Each curve uses end-of-epoch evaluation with the same current weights for training and validation.</w:t>
+      </w:r>
+    </w:p>
+    <w:p>
+      <w:r>
+        <w:br w:type="page"/>
       </w:r>
     </w:p>
     <w:p>
@@ -805,8 +4726,9 @@
         <w:keepNext/>
         <w:spacing w:after="180"/>
       </w:pPr>
+      <w:r/>
       <w:r>
-        <w:t>Question 4   IMDB sentiment analysis with an LSTM</w:t>
+        <w:t>Question 4   Initial LSTM baseline</w:t>
       </w:r>
     </w:p>
     <w:p>
@@ -846,7 +4768,7 @@
           <w:b w:val="0"/>
           <w:sz w:val="22"/>
         </w:rPr>
-        <w:t>I chose an LSTM because it is a type of RNN with a memory cell and gates that learn what information to keep, forget and pass on. This helps it retain context across long reviews and reduces the vanishing-gradient difficulty of a simple RNN. For example, it can learn to retain a negative statement while reading later details. A simple RNN is cheaper, and a GRU is another simpler gated alternative. I did not compare these models experimentally, so I cannot claim that the LSTM is always better.</w:t>
+        <w:t>I chose an LSTM because it is a type of RNN with a memory cell and gates that learn what information to keep, forget and pass on. This helps it retain context across long reviews and reduces the vanishing-gradient difficulty of a simple RNN. For example, it can learn to retain a negative statement while reading later details. A simple RNN is cheaper, and a GRU is another simpler gated alternative. At the baseline stage, I had not yet compared the architectures; this initial choice did not establish that LSTM was best.</w:t>
       </w:r>
     </w:p>
     <w:p>
@@ -2190,8 +6112,9 @@
         <w:keepNext/>
         <w:spacing w:after="180"/>
       </w:pPr>
+      <w:r/>
       <w:r>
-        <w:t>Question 4   Data split and results</w:t>
+        <w:t>Question 4   Initial LSTM data split and results</w:t>
       </w:r>
     </w:p>
     <w:p>
@@ -3315,8 +7238,9 @@
         <w:keepNext/>
         <w:spacing w:after="180"/>
       </w:pPr>
+      <w:r/>
       <w:r>
-        <w:t>Question 4   Learning curves</w:t>
+        <w:t>Question 4   Initial LSTM learning curves</w:t>
       </w:r>
     </w:p>
     <w:p>
@@ -3462,7 +7386,7 @@
           <w:b w:val="0"/>
           <w:sz w:val="22"/>
         </w:rPr>
-        <w:t>Results source: results_lstm/history.json and the saved accuracy and loss graphs from the 35-epoch run. The implementation is in imdb_lstm.py.</w:t>
+        <w:t>Results source: results_lstm/history.json and the saved accuracy and loss graphs from the 35-epoch run. The current imdb_lstm.py now runs the selected GRU; these figures describe the earlier LSTM baseline.</w:t>
       </w:r>
     </w:p>
     <w:sectPr>

</xml_diff>